<commit_message>
minor edits and data statement change
</commit_message>
<xml_diff>
--- a/docs/index.docx
+++ b/docs/index.docx
@@ -58,13 +58,31 @@
         <w:t xml:space="preserve">Polymer-coated slow-release fertilizers are a deliberate and quantifiable input of microplastics to agricultural soils, yet their fate in cold, snowmelt-dominated agro-ecosystems remains poorly characterized This pilot study investigated the in-field distribution and snowmelt export of polymer fertilizer coatings applied to two small agricultural watersheds in south-central Manitoba, Canada. Surface soils (0-5 cm) were sampled along hillslope transects at multiple dates following a single application, and spring snowmelt runoff was collected at the edge-of-field outlet of two small watersheds. Results showed that hillslope position and time since application significantly affected coating abundance and areal density, with lower slope positions accumulating more coatings than upper positions, consistent with downslope transport. Coatings persisted in surface soils over ~18 months with modest losses, and comparable abundances across 0-5 and 5-10 cm depth intervals indicating vertical mixing within the plow layer. During snowmelt, small amounts of coatings were exported with runoff from both watersheds. These findings demonstrate that agricultural soils can serve as a multi-year source of microplastics to downstream ecosystems and highlight the need for sampling protocols that account for spatial and temporal variability, as well as improved edge-of-field monitoring in cold regions to determine potential long-term impacts.</w:t>
       </w:r>
     </w:p>
-    <w:bookmarkStart w:id="9" w:name="highlights"/>
+    <w:p>
+      <w:pPr>
+        <w:pStyle w:val="FirstParagraph"/>
+      </w:pPr>
+      <w:r>
+        <w:rPr>
+          <w:b/>
+          <w:bCs/>
+        </w:rPr>
+        <w:t xml:space="preserve">Abbreviations</w:t>
+      </w:r>
+      <w:r>
+        <w:t xml:space="preserve"> </w:t>
+      </w:r>
+      <w:r>
+        <w:t xml:space="preserve">MP, microplastic; ESN, Environmentally Smart Nitrogen; STCW, South Tobacco Creek Watershed</w:t>
+      </w:r>
+    </w:p>
+    <w:bookmarkStart w:id="20" w:name="core-ideas"/>
     <w:p>
       <w:pPr>
         <w:pStyle w:val="Heading3"/>
       </w:pPr>
       <w:r>
-        <w:t xml:space="preserve">Highlights</w:t>
+        <w:t xml:space="preserve">Core ideas</w:t>
       </w:r>
     </w:p>
     <w:p>
@@ -111,8 +129,8 @@
         <w:t xml:space="preserve">Agricultural soils serve as a multi-year source of microplastics</w:t>
       </w:r>
     </w:p>
-    <w:bookmarkEnd w:id="9"/>
-    <w:bookmarkStart w:id="10" w:name="introduction"/>
+    <w:bookmarkEnd w:id="20"/>
+    <w:bookmarkStart w:id="21" w:name="introduction"/>
     <w:p>
       <w:pPr>
         <w:pStyle w:val="Heading2"/>
@@ -376,8 +394,8 @@
         <w:t xml:space="preserve">. The primary purpose of this pilot project was to investigate the fate of polymer coatings from slow-release fertilizers applied to agro-ecosystems in Manitoba, Canada. Because these coatings are applied in known quantities, locations, and timings, they are an ideal model plastic input for investigating the fate of agricultural MPs. The objectives of this study were to: 1) characterize the lateral and vertical movement of polymer coatings within surface soils; and 2) quantify the potential for export of polymer coatings from cropland in surface runoff during spring snowmelt.</w:t>
       </w:r>
     </w:p>
-    <w:bookmarkEnd w:id="10"/>
-    <w:bookmarkStart w:id="26" w:name="methods"/>
+    <w:bookmarkEnd w:id="21"/>
+    <w:bookmarkStart w:id="32" w:name="methods"/>
     <w:p>
       <w:pPr>
         <w:pStyle w:val="Heading2"/>
@@ -386,7 +404,7 @@
         <w:t xml:space="preserve">2 Methods</w:t>
       </w:r>
     </w:p>
-    <w:bookmarkStart w:id="21" w:name="site-description"/>
+    <w:bookmarkStart w:id="27" w:name="site-description"/>
     <w:p>
       <w:pPr>
         <w:pStyle w:val="Heading3"/>
@@ -478,7 +496,7 @@
       <w:tr>
         <w:tc>
           <w:tcPr/>
-          <w:bookmarkStart w:id="14" w:name="fig-mapr"/>
+          <w:bookmarkStart w:id="25" w:name="fig-mapr"/>
           <w:p>
             <w:pPr>
               <w:pStyle w:val="Compact"/>
@@ -489,18 +507,18 @@
                 <wp:inline>
                   <wp:extent cx="5943600" cy="3145043"/>
                   <wp:effectExtent b="0" l="0" r="0" t="0"/>
-                  <wp:docPr descr="" title="" id="12" name="Picture"/>
+                  <wp:docPr descr="" title="" id="23" name="Picture"/>
                   <a:graphic>
                     <a:graphicData uri="http://schemas.openxmlformats.org/drawingml/2006/picture">
                       <pic:pic>
                         <pic:nvPicPr>
-                          <pic:cNvPr descr="index_files/figure-docx/notebooks-maps-fig-mapr-output-2.png" id="13" name="Picture"/>
+                          <pic:cNvPr descr="index_files/figure-docx/notebooks-maps-fig-mapr-output-2.png" id="24" name="Picture"/>
                           <pic:cNvPicPr>
                             <a:picLocks noChangeArrowheads="1" noChangeAspect="1"/>
                           </pic:cNvPicPr>
                         </pic:nvPicPr>
                         <pic:blipFill>
-                          <a:blip r:embed="rId11"/>
+                          <a:blip r:embed="rId22"/>
                           <a:stretch>
                             <a:fillRect/>
                           </a:stretch>
@@ -532,7 +550,7 @@
               <w:jc w:val="center"/>
             </w:pPr>
             <w:pPr>
-              <w:jc w:val="left"/>
+              <w:jc w:val="start"/>
               <w:spacing w:before="200"/>
               <w:pStyle w:val="ImageCaption"/>
             </w:pPr>
@@ -540,7 +558,7 @@
               <w:t xml:space="preserve">Figure 1: Showing a) the location of the study site in southern Manitoba with an inset map of Canada; and b) the locations of the four transects and three slope positions sampled in the East and West watersheds. Red squares indicate locations of V-notched weirs</w:t>
             </w:r>
           </w:p>
-          <w:bookmarkEnd w:id="14"/>
+          <w:bookmarkEnd w:id="25"/>
         </w:tc>
       </w:tr>
     </w:tbl>
@@ -560,7 +578,7 @@
         </w:rPr>
         <w:t xml:space="preserve"> </w:t>
       </w:r>
-      <w:hyperlink r:id="rId15">
+      <w:hyperlink r:id="rId26">
         <w:r>
           <w:rPr>
             <w:rStyle w:val="InternetLink"/>
@@ -615,7 +633,7 @@
         <w:t xml:space="preserve">)</w:t>
       </w:r>
       <w:r>
-        <w:t xml:space="preserve">. Both watersheds are now managed under the same tillage practices. Polymer-coated urea (Environmental Smart Nitrogen (ESN);</w:t>
+        <w:t xml:space="preserve">. Both watersheds are now managed under the same tillage practices. Polymer-coated urea (Environmentally Smart Nitrogen (ESN);</w:t>
       </w:r>
       <w:r>
         <w:t xml:space="preserve"> </w:t>
@@ -649,12 +667,12 @@
       <w:r>
         <w:t xml:space="preserve">on 2022-05-24 using a spin spreader and incorporated into the surface soil with the seeding of canola on 2022-05-25 using an air hoe drill. The drill, equipped with shovels, provided soil disturbance comparable to a cultivator pass, and packer wheels ensured close soil-to-ESN contact. Following canola harvest, the field was tilled to a depth of 10 to 15 cm using a field cultivator on 2022-10-29. A conventional fertilizer blend (not polymer coated) was applied in the spring of 2023 and incorporated into the soil with a single pass of the field cultivator prior to the seeding of spring wheat using the air hoe drill on 2023-05-11 (</w:t>
       </w:r>
-      <w:hyperlink w:anchor="fig-weather-climate">
-        <w:r>
-          <w:rPr>
-            <w:rStyle w:val="InternetLink"/>
-          </w:rPr>
-          <w:t xml:space="preserve">Figure 2</w:t>
+      <w:hyperlink w:anchor="suppfig-weather-climate">
+        <w:r>
+          <w:rPr>
+            <w:rStyle w:val="InternetLink"/>
+          </w:rPr>
+          <w:t xml:space="preserve">Figure S2</w:t>
         </w:r>
       </w:hyperlink>
       <w:r>
@@ -681,119 +699,85 @@
         <w:t xml:space="preserve">. This polymer coating is designed to release nitrogen in response to soil temperatures to more closely match the demand of the crop reducing the potential losses through denitrification, volatilization, and leaching.</w:t>
       </w:r>
     </w:p>
-    <w:tbl>
-      <w:tblPr>
-        <w:tblStyle w:val="Table"/>
-        <w:tblW w:type="pct" w:w="5000"/>
-        <w:tblLayout w:type="fixed"/>
-        <w:tblLook w:firstRow="0" w:lastRow="0" w:firstColumn="0" w:lastColumn="0" w:noHBand="0" w:noVBand="0" w:val="0000"/>
-      </w:tblPr>
-      <w:tblGrid>
-        <w:gridCol w:w="7920"/>
-      </w:tblGrid>
-      <w:tr>
-        <w:tc>
-          <w:tcPr/>
-          <w:bookmarkStart w:id="19" w:name="fig-weather-climate"/>
-          <w:p>
-            <w:pPr>
-              <w:pStyle w:val="Compact"/>
-              <w:jc w:val="center"/>
-            </w:pPr>
-            <w:r>
-              <w:drawing>
-                <wp:inline>
-                  <wp:extent cx="5943600" cy="4245428"/>
-                  <wp:effectExtent b="0" l="0" r="0" t="0"/>
-                  <wp:docPr descr="" title="" id="17" name="Picture"/>
-                  <a:graphic>
-                    <a:graphicData uri="http://schemas.openxmlformats.org/drawingml/2006/picture">
-                      <pic:pic>
-                        <pic:nvPicPr>
-                          <pic:cNvPr descr="index_files/figure-docx/notebooks-weather_climate-fig-weather-climate-output-2.png" id="18" name="Picture"/>
-                          <pic:cNvPicPr>
-                            <a:picLocks noChangeArrowheads="1" noChangeAspect="1"/>
-                          </pic:cNvPicPr>
-                        </pic:nvPicPr>
-                        <pic:blipFill>
-                          <a:blip r:embed="rId16"/>
-                          <a:stretch>
-                            <a:fillRect/>
-                          </a:stretch>
-                        </pic:blipFill>
-                        <pic:spPr bwMode="auto">
-                          <a:xfrm>
-                            <a:off x="0" y="0"/>
-                            <a:ext cx="5943600" cy="4245428"/>
-                          </a:xfrm>
-                          <a:prstGeom prst="rect">
-                            <a:avLst/>
-                          </a:prstGeom>
-                          <a:noFill/>
-                          <a:ln w="9525">
-                            <a:noFill/>
-                            <a:headEnd/>
-                            <a:tailEnd/>
-                          </a:ln>
-                        </pic:spPr>
-                      </pic:pic>
-                    </a:graphicData>
-                  </a:graphic>
-                </wp:inline>
-              </w:drawing>
-            </w:r>
-          </w:p>
-          <w:p>
-            <w:pPr>
-              <w:jc w:val="center"/>
-            </w:pPr>
-            <w:pPr>
-              <w:jc w:val="left"/>
-              <w:spacing w:before="200"/>
-              <w:pStyle w:val="ImageCaption"/>
-            </w:pPr>
-            <w:r>
-              <w:t xml:space="preserve">Figure 2: Weather conditions for the 2022 and 2023 water years (Oct 1 - Sept 30) for Deerwood, MB (Station ID 29886), located approximately 8 km from the field site. Vertical lines indicate the timing of (1) application of Environmental Smart Nitrogen (ESN) (polymer-coated slow-release urea); (2) seeding and tillage field operations; and (3) collection of soil and runoff samples. Red and blue points indicate average daily temperatures above and below 0 degrees Celsius, respectively. The blue line indicates cumulative precipitation over the hydrologic year.</w:t>
-            </w:r>
-          </w:p>
-          <w:bookmarkEnd w:id="19"/>
-        </w:tc>
-      </w:tr>
-    </w:tbl>
+    <w:bookmarkEnd w:id="27"/>
+    <w:bookmarkStart w:id="28" w:name="soil-sampling-and-analysis"/>
+    <w:p>
+      <w:pPr>
+        <w:pStyle w:val="Heading3"/>
+      </w:pPr>
+      <w:r>
+        <w:t xml:space="preserve">2.2 Soil sampling and analysis</w:t>
+      </w:r>
+    </w:p>
+    <w:p>
+      <w:pPr>
+        <w:pStyle w:val="FirstParagraph"/>
+      </w:pPr>
+      <w:r>
+        <w:t xml:space="preserve">Soil sampling was conducted at locations established in previous research</w:t>
+      </w:r>
+      <w:r>
+        <w:t xml:space="preserve"> </w:t>
+      </w:r>
+      <w:r>
+        <w:t xml:space="preserve">(</w:t>
+      </w:r>
+      <w:hyperlink w:anchor="ref-tiessen2010">
+        <w:r>
+          <w:rPr>
+            <w:rStyle w:val="InternetLink"/>
+          </w:rPr>
+          <w:t xml:space="preserve">Tiessen et al., 2010</w:t>
+        </w:r>
+      </w:hyperlink>
+      <w:r>
+        <w:t xml:space="preserve">)</w:t>
+      </w:r>
+      <w:r>
+        <w:t xml:space="preserve"> </w:t>
+      </w:r>
+      <w:r>
+        <w:t xml:space="preserve">along four transects in each of the watersheds, with each transect spanning three hillslope positions: upper, mid, and lower slope (</w:t>
+      </w:r>
+      <w:hyperlink w:anchor="fig-mapr">
+        <w:r>
+          <w:rPr>
+            <w:rStyle w:val="InternetLink"/>
+          </w:rPr>
+          <w:t xml:space="preserve">Figure 1</w:t>
+        </w:r>
+      </w:hyperlink>
+      <w:r>
+        <w:t xml:space="preserve">), giving 24 sampling locations in total. Samples were collected on three dates: 21 October 2022, 11 May 2023, and 19 September 2023 (</w:t>
+      </w:r>
+      <w:hyperlink w:anchor="suppfig-weather-climate">
+        <w:r>
+          <w:rPr>
+            <w:rStyle w:val="InternetLink"/>
+          </w:rPr>
+          <w:t xml:space="preserve">Figure S2</w:t>
+        </w:r>
+      </w:hyperlink>
+      <w:r>
+        <w:t xml:space="preserve">). Surface soil samples were excavated with a spade from a 25 cm × 25 cm square to a depth of 5 cm, yielding a sample volume of 3125 cm³. On 19 September 2023, an additional sample was collected at each location from the 5–10 cm depth interval. On this date, two additional surface riparian samples were also collected from the grassed area between the edge of the cultivated field and the v-notch weir.</w:t>
+      </w:r>
+    </w:p>
     <w:p>
       <w:pPr>
         <w:pStyle w:val="TextBody"/>
       </w:pPr>
       <w:r>
-        <w:rPr>
-          <w:vertAlign w:val="subscript"/>
-        </w:rPr>
-        <w:t xml:space="preserve">Source:</w:t>
-      </w:r>
-      <w:r>
-        <w:rPr>
-          <w:vertAlign w:val="subscript"/>
-        </w:rPr>
-        <w:t xml:space="preserve"> </w:t>
-      </w:r>
-      <w:hyperlink r:id="rId20">
-        <w:r>
-          <w:rPr>
-            <w:rStyle w:val="InternetLink"/>
-            <w:vertAlign w:val="subscript"/>
-          </w:rPr>
-          <w:t xml:space="preserve">02 Climate and weather</w:t>
-        </w:r>
-      </w:hyperlink>
-    </w:p>
-    <w:bookmarkEnd w:id="21"/>
-    <w:bookmarkStart w:id="22" w:name="soil-sampling-and-analysis"/>
+        <w:t xml:space="preserve">Soil samples were disaggregated by hand into smaller aggregates and air-dried. Each sample was further manually disaggregated and sieved sequentially through 2-mm and 1.18-mm meshes. Polymer coatings were retrieved from the sieves using tweezers. The extracted coatings were cleaned by magnetic stirring in distilled water for 10 minutes at 500 rpm, then filtered and dried at 30 °C. The cleaned and dried polymer coatings were counted and collectively weighed using a balance with 0.1 mg resolution.</w:t>
+      </w:r>
+    </w:p>
+    <w:bookmarkEnd w:id="28"/>
+    <w:bookmarkStart w:id="30" w:name="runoff-and-water-sampling"/>
     <w:p>
       <w:pPr>
         <w:pStyle w:val="Heading3"/>
       </w:pPr>
       <w:r>
-        <w:t xml:space="preserve">2.2 Soil sampling and analysis</w:t>
+        <w:t xml:space="preserve">2.3 Runoff and water sampling</w:t>
       </w:r>
     </w:p>
     <w:p>
@@ -801,7 +785,7 @@
         <w:pStyle w:val="FirstParagraph"/>
       </w:pPr>
       <w:r>
-        <w:t xml:space="preserve">Soil sampling was conducted at locations established in previous research</w:t>
+        <w:t xml:space="preserve">Sharp crested 90° V-notch weirs were present at the edge-of-field outlets of two small watersheds draining the study field. Measurement of flow at these sites has been ongoing for over 2 decades, primarily in support of research to characterized factors controlling nutrient transport, with methods initially detailed in Tiessen et al. (2010). For the present study period, water depth at the weirs was recorded at 5-min intervals using a pressure transducer (Onset HOBO Water Level Data Logger). The water depth were then used to calculate flow, based on a standard V-notched weir flow equation</w:t>
       </w:r>
       <w:r>
         <w:t xml:space="preserve"> </w:t>
@@ -809,44 +793,19 @@
       <w:r>
         <w:t xml:space="preserve">(</w:t>
       </w:r>
-      <w:hyperlink w:anchor="ref-tiessen2010">
-        <w:r>
-          <w:rPr>
-            <w:rStyle w:val="InternetLink"/>
-          </w:rPr>
-          <w:t xml:space="preserve">Tiessen et al., 2010</w:t>
+      <w:hyperlink w:anchor="ref-astm_d5242_92">
+        <w:r>
+          <w:rPr>
+            <w:rStyle w:val="InternetLink"/>
+          </w:rPr>
+          <w:t xml:space="preserve">ASTM International, 1992</w:t>
         </w:r>
       </w:hyperlink>
       <w:r>
         <w:t xml:space="preserve">)</w:t>
       </w:r>
       <w:r>
-        <w:t xml:space="preserve"> </w:t>
-      </w:r>
-      <w:r>
-        <w:t xml:space="preserve">along four transects in each of the watersheds, with each transect spanning three hillslope positions: upper, mid, and lower slope (</w:t>
-      </w:r>
-      <w:hyperlink w:anchor="fig-mapr">
-        <w:r>
-          <w:rPr>
-            <w:rStyle w:val="InternetLink"/>
-          </w:rPr>
-          <w:t xml:space="preserve">Figure 1</w:t>
-        </w:r>
-      </w:hyperlink>
-      <w:r>
-        <w:t xml:space="preserve">), giving 24 sampling locations in total. Samples were collected on three dates: 21 October 2022, 11 May 2023, and 19 September 2023 (</w:t>
-      </w:r>
-      <w:hyperlink w:anchor="fig-weather-climate">
-        <w:r>
-          <w:rPr>
-            <w:rStyle w:val="InternetLink"/>
-          </w:rPr>
-          <w:t xml:space="preserve">Figure 2</w:t>
-        </w:r>
-      </w:hyperlink>
-      <w:r>
-        <w:t xml:space="preserve">). Surface soil samples were excavated with a spade from a 25 cm × 25 cm square to a depth of 5 cm, yielding a sample volume of 3125 cm³. On 19 September 2023, an additional sample was collected at each location from the 5–10 cm depth interval. On this date, two additional surface riparian samples were also collected from the grassed area between the edge of the cultivated field and the v-notch weir.</w:t>
+        <w:t xml:space="preserve">. Throughout the runoff event, staff gauges read manually during in person visits and from time-lapse photography were used to calibrate the logger-collected water depth data to depth from base of the V-notch weir.</w:t>
       </w:r>
     </w:p>
     <w:p>
@@ -854,71 +813,25 @@
         <w:pStyle w:val="TextBody"/>
       </w:pPr>
       <w:r>
-        <w:t xml:space="preserve">Soil samples were disaggregated by hand into smaller aggregates and air-dried. Each sample was further manually disaggregated and sieved sequentially through 2-mm and 1.18-mm meshes. Polymer coatings were retrieved from the sieves using tweezers. The extracted coatings were cleaned by magnetic stirring in distilled water for 10 minutes at 500 rpm, then filtered and dried at 30 °C. The cleaned and dried polymer coatings were counted and collectively weighed using a balance with 0.1 mg resolution.</w:t>
-      </w:r>
-    </w:p>
-    <w:bookmarkEnd w:id="22"/>
-    <w:bookmarkStart w:id="24" w:name="runoff-and-water-sampling"/>
-    <w:p>
-      <w:pPr>
-        <w:pStyle w:val="Heading3"/>
-      </w:pPr>
-      <w:r>
-        <w:t xml:space="preserve">2.3 Runoff and water sampling</w:t>
-      </w:r>
-    </w:p>
-    <w:p>
-      <w:pPr>
-        <w:pStyle w:val="FirstParagraph"/>
-      </w:pPr>
-      <w:r>
-        <w:t xml:space="preserve">Sharp crested 90° V-notch weirs were present at the edge-of-field outlets of two small watersheds draining the study field. Measurement of flow at these sites has been ongoing for over 2 decades, primarily in support of research to characterized factors controlling nutrient transport, with methods initially detailed in Tiessen et al. (2010). For the present study period, water depth at the weirs was recorded at 5-min intervals using a pressure transducer (Onset HOBO Water Level Data Logger). The water depth were then used to calculate flow, based on a standard V-notched weir flow equation</w:t>
-      </w:r>
-      <w:r>
-        <w:t xml:space="preserve"> </w:t>
-      </w:r>
-      <w:r>
-        <w:t xml:space="preserve">(</w:t>
-      </w:r>
-      <w:hyperlink w:anchor="ref-astm_d5242_92">
-        <w:r>
-          <w:rPr>
-            <w:rStyle w:val="InternetLink"/>
-          </w:rPr>
-          <w:t xml:space="preserve">ASTM International, 1992</w:t>
-        </w:r>
-      </w:hyperlink>
-      <w:r>
-        <w:t xml:space="preserve">)</w:t>
-      </w:r>
-      <w:r>
-        <w:t xml:space="preserve">. Throughout the runoff event, staff gauges read manually during in person visits and from time-lapse photography were used to calibrate the logger-collected water depth data to depth from base of the V-notch weir.</w:t>
+        <w:t xml:space="preserve">Edge-of-field runoff was sampled for polymer coatings twice daily at both weirs during daytime peak-melt hours (10:00 to 16:00) on the days following the initial confirmed snowmelt flow event on 2023-04-11, continuing through to the end of the snowmelt period on 2023-04-14. Because of poor road conditions and restricted site access, no sampling occurred on the second day of the spring snowmelt event (2023-04-12). Edge-of-field runoff was sampled on 2023-04-13 and 2023-04-14. Polymer coatings were collected from the runoff using a simple filtration system consisting of 1-mm screening set across the upstream side of the v notch. These screens were deployed for a maximum duration of two hours and switched twice a day for a total of four measurement periods at each weir over the spring runoff event. Polymer coatings were extracted from the screens using tweezers. The polymer coatings were dried at 30° C, counted and weighed. A cumulative volume of water exported over each time period of sampling for polymer coatings was calculated. An estimate of volume-weighted mean concentration was calculated for each watershed by dividing the total number of polymer coatings collected during all sampling intervals by the total volume runoff measured during those intervals (coatings m⁻³). The total number of polymer coatings exported over the course of snowmelt was extrapolated by multiplying the total accumulated volume of water by the volume-weighted mean concentration of polymer coatings (</w:t>
+      </w:r>
+      <w:hyperlink w:anchor="eq-poly">
+        <w:r>
+          <w:rPr>
+            <w:rStyle w:val="InternetLink"/>
+          </w:rPr>
+          <w:t xml:space="preserve">Equation 1</w:t>
+        </w:r>
+      </w:hyperlink>
+      <w:r>
+        <w:t xml:space="preserve">). Polymer coating concentration was assumed to be independent of discharge.</w:t>
       </w:r>
     </w:p>
     <w:p>
       <w:pPr>
         <w:pStyle w:val="TextBody"/>
       </w:pPr>
-      <w:r>
-        <w:t xml:space="preserve">Edge-of-field runoff was sampled for polymer coatings twice daily at both weirs during daytime peak-melt hours (10:00 to 16:00) on the days following the initial confirmed snowmelt flow event on 2023-04-11, continuing through to the end of the snowmelt period on 2023-04-14. Because of poor road conditions and restricted site access, no sampling occurred on the second day of the spring snowmelt event (2023-04-12). Edge-of-field runoff was sampled on 2023-04-13 and 2023-04-14. Polymer coatings were collected from the runoff using a simple filtration system consisting of 1-mm screening set across the upstream side of the v notch. These screens were deployed for a maximum duration of two hours and switched twice a day for a total of four measurement periods at each weir over the spring runoff event. Polymer coatings were extracted from the screens using tweezers. The polymer coatings were dried at 30° C, counted and weighed. A cumulative volume of water exported over each time period of sampling for polymer coatings was calculated. An estimate of volume-weighted mean concentration was calculated for each watershed by dividing the total number of polymer coatings collected during all sampling intervals by the total volume runoff measured during those intervals (coatings m⁻³). The total number of polymer coatings exported over the course of snowmelt was extrapolated by multiplying the total accumulated volume of water by the volume-weighted mean concentration of polymer coatings (</w:t>
-      </w:r>
-      <w:hyperlink w:anchor="eq-poly">
-        <w:r>
-          <w:rPr>
-            <w:rStyle w:val="InternetLink"/>
-          </w:rPr>
-          <w:t xml:space="preserve">Equation 1</w:t>
-        </w:r>
-      </w:hyperlink>
-      <w:r>
-        <w:t xml:space="preserve">). Polymer coating concentration was assumed to be independent of discharge.</w:t>
-      </w:r>
-    </w:p>
-    <w:p>
-      <w:pPr>
-        <w:pStyle w:val="TextBody"/>
-      </w:pPr>
-      <w:bookmarkStart w:id="23" w:name="eq-poly"/>
+      <w:bookmarkStart w:id="29" w:name="eq-poly"/>
       <m:oMathPara>
         <m:oMathParaPr>
           <m:jc m:val="center"/>
@@ -1042,24 +955,22 @@
           <m:r>
             <m:t>  </m:t>
           </m:r>
-          <m:r>
-            <m:rPr>
-              <m:sty m:val="p"/>
-            </m:rPr>
-            <m:t>(</m:t>
-          </m:r>
-          <m:r>
-            <m:t>1</m:t>
-          </m:r>
-          <m:r>
-            <m:rPr>
-              <m:sty m:val="p"/>
-            </m:rPr>
-            <m:t>)</m:t>
-          </m:r>
+          <m:d>
+            <m:dPr>
+              <m:begChr m:val="("/>
+              <m:endChr m:val=")"/>
+              <m:sepChr m:val=""/>
+              <m:grow/>
+            </m:dPr>
+            <m:e>
+              <m:r>
+                <m:t>1</m:t>
+              </m:r>
+            </m:e>
+          </m:d>
         </m:oMath>
       </m:oMathPara>
-      <w:bookmarkEnd w:id="23"/>
+      <w:bookmarkEnd w:id="29"/>
     </w:p>
     <w:p>
       <w:pPr>
@@ -1206,8 +1117,8 @@
         <w:t xml:space="preserve">is the number of measurement periods.</w:t>
       </w:r>
     </w:p>
-    <w:bookmarkEnd w:id="24"/>
-    <w:bookmarkStart w:id="25" w:name="statistical-analysis"/>
+    <w:bookmarkEnd w:id="30"/>
+    <w:bookmarkStart w:id="31" w:name="statistical-analysis"/>
     <w:p>
       <w:pPr>
         <w:pStyle w:val="Heading3"/>
@@ -1599,9 +1510,9 @@
         <w:t xml:space="preserve">).</w:t>
       </w:r>
     </w:p>
-    <w:bookmarkEnd w:id="25"/>
-    <w:bookmarkEnd w:id="26"/>
-    <w:bookmarkStart w:id="50" w:name="results-and-discussion"/>
+    <w:bookmarkEnd w:id="31"/>
+    <w:bookmarkEnd w:id="32"/>
+    <w:bookmarkStart w:id="54" w:name="results-and-discussion"/>
     <w:p>
       <w:pPr>
         <w:pStyle w:val="Heading2"/>
@@ -1610,7 +1521,7 @@
         <w:t xml:space="preserve">3 Results and Discussion</w:t>
       </w:r>
     </w:p>
-    <w:bookmarkStart w:id="41" w:name="in-field-abundance-and-distribution"/>
+    <w:bookmarkStart w:id="47" w:name="in-field-abundance-and-distribution"/>
     <w:p>
       <w:pPr>
         <w:pStyle w:val="Heading3"/>
@@ -1631,147 +1542,147 @@
           <w:rPr>
             <w:rStyle w:val="InternetLink"/>
           </w:rPr>
+          <w:t xml:space="preserve">Figure 2</w:t>
+        </w:r>
+      </w:hyperlink>
+      <w:r>
+        <w:t xml:space="preserve">). Post-hoc pairwise comparisons showed that lower slope positions had significantly higher abundance, exceeding the upper positions by 112 coatings m⁻² and the mid positions by 94 coatings m⁻² (</w:t>
+      </w:r>
+      <w:hyperlink w:anchor="fig-poly-surface">
+        <w:r>
+          <w:rPr>
+            <w:rStyle w:val="InternetLink"/>
+          </w:rPr>
+          <w:t xml:space="preserve">Figure 2</w:t>
+        </w:r>
+      </w:hyperlink>
+      <w:r>
+        <w:t xml:space="preserve"> </w:t>
+      </w:r>
+      <w:r>
+        <w:t xml:space="preserve">and</w:t>
+      </w:r>
+      <w:r>
+        <w:t xml:space="preserve"> </w:t>
+      </w:r>
+      <w:hyperlink w:anchor="tbl-abundance-posthoc">
+        <w:r>
+          <w:rPr>
+            <w:rStyle w:val="InternetLink"/>
+          </w:rPr>
+          <w:t xml:space="preserve">Table 1</w:t>
+        </w:r>
+      </w:hyperlink>
+      <w:r>
+        <w:t xml:space="preserve">). Density followed a similar pattern, with the lower slope exceeding the upper positions by 0.12 g m⁻² and the mid positions by 0.09 g m⁻² (</w:t>
+      </w:r>
+      <w:hyperlink w:anchor="fig-poly-surface">
+        <w:r>
+          <w:rPr>
+            <w:rStyle w:val="InternetLink"/>
+          </w:rPr>
+          <w:t xml:space="preserve">Figure 2</w:t>
+        </w:r>
+      </w:hyperlink>
+      <w:r>
+        <w:t xml:space="preserve"> </w:t>
+      </w:r>
+      <w:r>
+        <w:t xml:space="preserve">and</w:t>
+      </w:r>
+      <w:r>
+        <w:t xml:space="preserve"> </w:t>
+      </w:r>
+      <w:hyperlink w:anchor="tbl-density-posthoc">
+        <w:r>
+          <w:rPr>
+            <w:rStyle w:val="InternetLink"/>
+          </w:rPr>
+          <w:t xml:space="preserve">Table 2</w:t>
+        </w:r>
+      </w:hyperlink>
+      <w:r>
+        <w:t xml:space="preserve">). There were some coatings observed in the riparian area surface soil, despite receiving no direct application (</w:t>
+      </w:r>
+      <w:hyperlink w:anchor="fig-poly-surface">
+        <w:r>
+          <w:rPr>
+            <w:rStyle w:val="InternetLink"/>
+          </w:rPr>
+          <w:t xml:space="preserve">Figure 2</w:t>
+        </w:r>
+      </w:hyperlink>
+      <w:r>
+        <w:t xml:space="preserve">).</w:t>
+      </w:r>
+    </w:p>
+    <w:p>
+      <w:pPr>
+        <w:pStyle w:val="TextBody"/>
+      </w:pPr>
+      <w:r>
+        <w:t xml:space="preserve">The downslope increase in polymer quantities could relate to movement via overland flow, as the buoyant nature of the coatings makes them easy to transport</w:t>
+      </w:r>
+      <w:r>
+        <w:t xml:space="preserve"> </w:t>
+      </w:r>
+      <w:r>
+        <w:t xml:space="preserve">(</w:t>
+      </w:r>
+      <w:hyperlink w:anchor="ref-rehm2021">
+        <w:r>
+          <w:rPr>
+            <w:rStyle w:val="InternetLink"/>
+          </w:rPr>
+          <w:t xml:space="preserve">Rehm et al., 2021</w:t>
+        </w:r>
+      </w:hyperlink>
+      <w:r>
+        <w:t xml:space="preserve">;</w:t>
+      </w:r>
+      <w:r>
+        <w:t xml:space="preserve"> </w:t>
+      </w:r>
+      <w:hyperlink w:anchor="ref-severe2025">
+        <w:r>
+          <w:rPr>
+            <w:rStyle w:val="InternetLink"/>
+          </w:rPr>
+          <w:t xml:space="preserve">Severe et al., 2025</w:t>
+        </w:r>
+      </w:hyperlink>
+      <w:r>
+        <w:t xml:space="preserve">)</w:t>
+      </w:r>
+      <w:r>
+        <w:t xml:space="preserve">. Similarly, tillage erosion may also move coatings downslope with the soil</w:t>
+      </w:r>
+      <w:r>
+        <w:t xml:space="preserve"> </w:t>
+      </w:r>
+      <w:r>
+        <w:t xml:space="preserve">(</w:t>
+      </w:r>
+      <w:hyperlink w:anchor="ref-maqbool2024">
+        <w:r>
+          <w:rPr>
+            <w:rStyle w:val="InternetLink"/>
+          </w:rPr>
+          <w:t xml:space="preserve">Maqbool et al., 2024</w:t>
+        </w:r>
+      </w:hyperlink>
+      <w:r>
+        <w:t xml:space="preserve">)</w:t>
+      </w:r>
+      <w:r>
+        <w:t xml:space="preserve">. The overall reduction in polymer in surface soils over time may result from loss beyond the field boundary through overland flow. However, vertical movement below 5 cm likely accounts for much of this observed loss in surface MPs over time, as field operations including seeding and tillage mix the plow layer, resulting in downward movement despite surface application. No coatings were observed below 5 cm within the riparian area, supporting the conclusion that tillage is the primary driver of vertical coating distribution. This is supported by data showing similar polymer abundance and areal densities in both the 0-5 and 5-10 cm sampling depths (</w:t>
+      </w:r>
+      <w:hyperlink w:anchor="fig-depth">
+        <w:r>
+          <w:rPr>
+            <w:rStyle w:val="InternetLink"/>
+          </w:rPr>
           <w:t xml:space="preserve">Figure 3</w:t>
-        </w:r>
-      </w:hyperlink>
-      <w:r>
-        <w:t xml:space="preserve">). Post-hoc pairwise comparisons showed that lower slope positions had significantly higher abundance, exceeding the upper positions by 112 coatings m⁻² and the mid positions by 94 coatings m⁻² (</w:t>
-      </w:r>
-      <w:hyperlink w:anchor="fig-poly-surface">
-        <w:r>
-          <w:rPr>
-            <w:rStyle w:val="InternetLink"/>
-          </w:rPr>
-          <w:t xml:space="preserve">Figure 3</w:t>
-        </w:r>
-      </w:hyperlink>
-      <w:r>
-        <w:t xml:space="preserve"> </w:t>
-      </w:r>
-      <w:r>
-        <w:t xml:space="preserve">and</w:t>
-      </w:r>
-      <w:r>
-        <w:t xml:space="preserve"> </w:t>
-      </w:r>
-      <w:hyperlink w:anchor="tbl-abundance-posthoc">
-        <w:r>
-          <w:rPr>
-            <w:rStyle w:val="InternetLink"/>
-          </w:rPr>
-          <w:t xml:space="preserve">Table 1</w:t>
-        </w:r>
-      </w:hyperlink>
-      <w:r>
-        <w:t xml:space="preserve">). Density followed a similar pattern, with the lower slope exceeding the upper positions by 0.12 g m⁻² and the mid positions by 0.09 g m⁻² (</w:t>
-      </w:r>
-      <w:hyperlink w:anchor="fig-poly-surface">
-        <w:r>
-          <w:rPr>
-            <w:rStyle w:val="InternetLink"/>
-          </w:rPr>
-          <w:t xml:space="preserve">Figure 3</w:t>
-        </w:r>
-      </w:hyperlink>
-      <w:r>
-        <w:t xml:space="preserve"> </w:t>
-      </w:r>
-      <w:r>
-        <w:t xml:space="preserve">and</w:t>
-      </w:r>
-      <w:r>
-        <w:t xml:space="preserve"> </w:t>
-      </w:r>
-      <w:hyperlink w:anchor="tbl-density-posthoc">
-        <w:r>
-          <w:rPr>
-            <w:rStyle w:val="InternetLink"/>
-          </w:rPr>
-          <w:t xml:space="preserve">Table 2</w:t>
-        </w:r>
-      </w:hyperlink>
-      <w:r>
-        <w:t xml:space="preserve">). There were some coatings observed in the riparian area surface soil, despite receiving no direct application (</w:t>
-      </w:r>
-      <w:hyperlink w:anchor="fig-poly-surface">
-        <w:r>
-          <w:rPr>
-            <w:rStyle w:val="InternetLink"/>
-          </w:rPr>
-          <w:t xml:space="preserve">Figure 3</w:t>
-        </w:r>
-      </w:hyperlink>
-      <w:r>
-        <w:t xml:space="preserve">).</w:t>
-      </w:r>
-    </w:p>
-    <w:p>
-      <w:pPr>
-        <w:pStyle w:val="TextBody"/>
-      </w:pPr>
-      <w:r>
-        <w:t xml:space="preserve">The downslope increase in polymer quantities could relate to movement via overland flow, as the buoyant nature of the coatings makes them easy to transport</w:t>
-      </w:r>
-      <w:r>
-        <w:t xml:space="preserve"> </w:t>
-      </w:r>
-      <w:r>
-        <w:t xml:space="preserve">(</w:t>
-      </w:r>
-      <w:hyperlink w:anchor="ref-rehm2021">
-        <w:r>
-          <w:rPr>
-            <w:rStyle w:val="InternetLink"/>
-          </w:rPr>
-          <w:t xml:space="preserve">Rehm et al., 2021</w:t>
-        </w:r>
-      </w:hyperlink>
-      <w:r>
-        <w:t xml:space="preserve">;</w:t>
-      </w:r>
-      <w:r>
-        <w:t xml:space="preserve"> </w:t>
-      </w:r>
-      <w:hyperlink w:anchor="ref-severe2025">
-        <w:r>
-          <w:rPr>
-            <w:rStyle w:val="InternetLink"/>
-          </w:rPr>
-          <w:t xml:space="preserve">Severe et al., 2025</w:t>
-        </w:r>
-      </w:hyperlink>
-      <w:r>
-        <w:t xml:space="preserve">)</w:t>
-      </w:r>
-      <w:r>
-        <w:t xml:space="preserve">. Similarly, tillage erosion may also move coatings downslope with the soil</w:t>
-      </w:r>
-      <w:r>
-        <w:t xml:space="preserve"> </w:t>
-      </w:r>
-      <w:r>
-        <w:t xml:space="preserve">(</w:t>
-      </w:r>
-      <w:hyperlink w:anchor="ref-maqbool2024">
-        <w:r>
-          <w:rPr>
-            <w:rStyle w:val="InternetLink"/>
-          </w:rPr>
-          <w:t xml:space="preserve">Maqbool et al., 2024</w:t>
-        </w:r>
-      </w:hyperlink>
-      <w:r>
-        <w:t xml:space="preserve">)</w:t>
-      </w:r>
-      <w:r>
-        <w:t xml:space="preserve">. The overall reduction in polymer in surface soils over time may result from loss beyond the field boundary through overland flow. However, vertical movement below 5 cm likely accounts for much of this observed loss in surface MPs over time, as field operations including seeding and tillage mix the plow layer, resulting in downward movement despite surface application. No coatings were observed below 5 cm within the riparian area, supporting the conclusion that tillage is the primary driver of vertical coating distribution. This is supported by data showing similar polymer abundance and areal densities in both the 0-5 and 5-10 cm sampling depths (</w:t>
-      </w:r>
-      <w:hyperlink w:anchor="fig-depth">
-        <w:r>
-          <w:rPr>
-            <w:rStyle w:val="InternetLink"/>
-          </w:rPr>
-          <w:t xml:space="preserve">Figure 4</w:t>
         </w:r>
       </w:hyperlink>
       <w:r>
@@ -1791,7 +1702,7 @@
       <w:tr>
         <w:tc>
           <w:tcPr/>
-          <w:bookmarkStart w:id="30" w:name="fig-poly-surface"/>
+          <w:bookmarkStart w:id="36" w:name="fig-poly-surface"/>
           <w:p>
             <w:pPr>
               <w:pStyle w:val="Compact"/>
@@ -1802,18 +1713,18 @@
                 <wp:inline>
                   <wp:extent cx="5943600" cy="4245428"/>
                   <wp:effectExtent b="0" l="0" r="0" t="0"/>
-                  <wp:docPr descr="" title="" id="28" name="Picture"/>
+                  <wp:docPr descr="" title="" id="34" name="Picture"/>
                   <a:graphic>
                     <a:graphicData uri="http://schemas.openxmlformats.org/drawingml/2006/picture">
                       <pic:pic>
                         <pic:nvPicPr>
-                          <pic:cNvPr descr="index_files/figure-docx/notebooks-soil_sampling-fig-poly-surface-output-1.png" id="29" name="Picture"/>
+                          <pic:cNvPr descr="index_files/figure-docx/notebooks-soil_sampling-fig-poly-surface-output-1.png" id="35" name="Picture"/>
                           <pic:cNvPicPr>
                             <a:picLocks noChangeArrowheads="1" noChangeAspect="1"/>
                           </pic:cNvPicPr>
                         </pic:nvPicPr>
                         <pic:blipFill>
-                          <a:blip r:embed="rId27"/>
+                          <a:blip r:embed="rId33"/>
                           <a:stretch>
                             <a:fillRect/>
                           </a:stretch>
@@ -1845,15 +1756,15 @@
               <w:jc w:val="center"/>
             </w:pPr>
             <w:pPr>
-              <w:jc w:val="left"/>
+              <w:jc w:val="start"/>
               <w:spacing w:before="200"/>
               <w:pStyle w:val="ImageCaption"/>
             </w:pPr>
             <w:r>
-              <w:t xml:space="preserve">Figure 3: Surface (0-5 cm) polymer areal density (a and b) and abundance (c and d) by elevation and date. Points show raw observations; Points outlined in black and error bars show model predictions with 95% CIs from a model fitted to square-root transformed data, back-transformed to the original scale. Within each plot significant differences (p&lt;0.05) between slope position or sampling dates are denoted with different letters. Because the riparian area had fewer sampling locations and was only sampled on 2023-09-19 it was excluded from the statistical analysis</w:t>
+              <w:t xml:space="preserve">Figure 2: Surface (0-5 cm) polymer areal density (a and b) and abundance (c and d) by elevation and date. Points show raw observations; Points outlined in black and error bars show model predictions with 95% CIs from a model fitted to square-root transformed data, back-transformed to the original scale. Within each plot significant differences (p&lt;0.05) between slope position or sampling dates are denoted with different letters. Because the riparian area had fewer sampling locations and was only sampled on 2023-09-19 it was excluded from the statistical analysis</w:t>
             </w:r>
           </w:p>
-          <w:bookmarkEnd w:id="30"/>
+          <w:bookmarkEnd w:id="36"/>
         </w:tc>
       </w:tr>
     </w:tbl>
@@ -1873,7 +1784,7 @@
         </w:rPr>
         <w:t xml:space="preserve"> </w:t>
       </w:r>
-      <w:hyperlink r:id="rId31">
+      <w:hyperlink r:id="rId37">
         <w:r>
           <w:rPr>
             <w:rStyle w:val="InternetLink"/>
@@ -1896,13 +1807,13 @@
       <w:tr>
         <w:tc>
           <w:tcPr/>
-          <w:bookmarkStart w:id="32" w:name="tbl-abundance-posthoc"/>
+          <w:bookmarkStart w:id="38" w:name="tbl-abundance-posthoc"/>
           <w:p>
             <w:pPr>
               <w:jc w:val="center"/>
             </w:pPr>
             <w:pPr>
-              <w:jc w:val="left"/>
+              <w:jc w:val="start"/>
               <w:spacing w:before="200"/>
               <w:pStyle w:val="ImageCaption"/>
             </w:pPr>
@@ -2572,7 +2483,7 @@
               </w:tc>
             </w:tr>
           </w:tbl>
-          <w:bookmarkEnd w:id="32"/>
+          <w:bookmarkEnd w:id="38"/>
           <w:p/>
         </w:tc>
       </w:tr>
@@ -2593,7 +2504,7 @@
         </w:rPr>
         <w:t xml:space="preserve"> </w:t>
       </w:r>
-      <w:hyperlink r:id="rId33">
+      <w:hyperlink r:id="rId39">
         <w:r>
           <w:rPr>
             <w:rStyle w:val="InternetLink"/>
@@ -2616,13 +2527,13 @@
       <w:tr>
         <w:tc>
           <w:tcPr/>
-          <w:bookmarkStart w:id="34" w:name="tbl-density-posthoc"/>
+          <w:bookmarkStart w:id="40" w:name="tbl-density-posthoc"/>
           <w:p>
             <w:pPr>
               <w:jc w:val="center"/>
             </w:pPr>
             <w:pPr>
-              <w:jc w:val="left"/>
+              <w:jc w:val="start"/>
               <w:spacing w:before="200"/>
               <w:pStyle w:val="ImageCaption"/>
             </w:pPr>
@@ -3179,7 +3090,7 @@
               </w:tc>
             </w:tr>
           </w:tbl>
-          <w:bookmarkEnd w:id="34"/>
+          <w:bookmarkEnd w:id="40"/>
           <w:p/>
         </w:tc>
       </w:tr>
@@ -3200,7 +3111,7 @@
         </w:rPr>
         <w:t xml:space="preserve"> </w:t>
       </w:r>
-      <w:hyperlink r:id="rId35">
+      <w:hyperlink r:id="rId41">
         <w:r>
           <w:rPr>
             <w:rStyle w:val="InternetLink"/>
@@ -3223,239 +3134,7 @@
       <w:tr>
         <w:tc>
           <w:tcPr/>
-          <w:bookmarkStart w:id="39" w:name="fig-depth"/>
-          <w:p>
-            <w:pPr>
-              <w:pStyle w:val="Compact"/>
-              <w:jc w:val="center"/>
-            </w:pPr>
-            <w:r>
-              <w:drawing>
-                <wp:inline>
-                  <wp:extent cx="5943600" cy="4245428"/>
-                  <wp:effectExtent b="0" l="0" r="0" t="0"/>
-                  <wp:docPr descr="" title="" id="37" name="Picture"/>
-                  <a:graphic>
-                    <a:graphicData uri="http://schemas.openxmlformats.org/drawingml/2006/picture">
-                      <pic:pic>
-                        <pic:nvPicPr>
-                          <pic:cNvPr descr="index_files/figure-docx/notebooks-soil_sampling-fig-depth-output-1.png" id="38" name="Picture"/>
-                          <pic:cNvPicPr>
-                            <a:picLocks noChangeArrowheads="1" noChangeAspect="1"/>
-                          </pic:cNvPicPr>
-                        </pic:nvPicPr>
-                        <pic:blipFill>
-                          <a:blip r:embed="rId36"/>
-                          <a:stretch>
-                            <a:fillRect/>
-                          </a:stretch>
-                        </pic:blipFill>
-                        <pic:spPr bwMode="auto">
-                          <a:xfrm>
-                            <a:off x="0" y="0"/>
-                            <a:ext cx="5943600" cy="4245428"/>
-                          </a:xfrm>
-                          <a:prstGeom prst="rect">
-                            <a:avLst/>
-                          </a:prstGeom>
-                          <a:noFill/>
-                          <a:ln w="9525">
-                            <a:noFill/>
-                            <a:headEnd/>
-                            <a:tailEnd/>
-                          </a:ln>
-                        </pic:spPr>
-                      </pic:pic>
-                    </a:graphicData>
-                  </a:graphic>
-                </wp:inline>
-              </w:drawing>
-            </w:r>
-          </w:p>
-          <w:p>
-            <w:pPr>
-              <w:jc w:val="center"/>
-            </w:pPr>
-            <w:pPr>
-              <w:jc w:val="left"/>
-              <w:spacing w:before="200"/>
-              <w:pStyle w:val="ImageCaption"/>
-            </w:pPr>
-            <w:r>
-              <w:t xml:space="preserve">Figure 4: Polymer density (a) and abundance (b) for two sampling depths (0-5 and 5-10 cm) and the combined (0-10 cm) by slope position. Samples were collected on 2023-09-19 and no polymer was detected below 5 cm in the riparian area.</w:t>
-            </w:r>
-          </w:p>
-          <w:bookmarkEnd w:id="39"/>
-        </w:tc>
-      </w:tr>
-    </w:tbl>
-    <w:p>
-      <w:pPr>
-        <w:pStyle w:val="TextBody"/>
-      </w:pPr>
-      <w:r>
-        <w:rPr>
-          <w:vertAlign w:val="subscript"/>
-        </w:rPr>
-        <w:t xml:space="preserve">Source:</w:t>
-      </w:r>
-      <w:r>
-        <w:rPr>
-          <w:vertAlign w:val="subscript"/>
-        </w:rPr>
-        <w:t xml:space="preserve"> </w:t>
-      </w:r>
-      <w:hyperlink r:id="rId40">
-        <w:r>
-          <w:rPr>
-            <w:rStyle w:val="InternetLink"/>
-            <w:vertAlign w:val="subscript"/>
-          </w:rPr>
-          <w:t xml:space="preserve">03 Soil sampling</w:t>
-        </w:r>
-      </w:hyperlink>
-    </w:p>
-    <w:p>
-      <w:pPr>
-        <w:pStyle w:val="TextBody"/>
-      </w:pPr>
-      <w:r>
-        <w:t xml:space="preserve">The distribution of MPs in soil within agro-ecosystems is dynamic in both space and time, and continued research in this area must account for both dimensions when developing research ideas and sampling strategies. Currently, few guidelines or established sampling protocols are in place</w:t>
-      </w:r>
-      <w:r>
-        <w:t xml:space="preserve"> </w:t>
-      </w:r>
-      <w:r>
-        <w:t xml:space="preserve">(</w:t>
-      </w:r>
-      <w:hyperlink w:anchor="ref-chia2024">
-        <w:r>
-          <w:rPr>
-            <w:rStyle w:val="InternetLink"/>
-          </w:rPr>
-          <w:t xml:space="preserve">Chia et al., 2024</w:t>
-        </w:r>
-      </w:hyperlink>
-      <w:r>
-        <w:t xml:space="preserve">)</w:t>
-      </w:r>
-      <w:r>
-        <w:t xml:space="preserve">. The results of this study suggest that a transect approach along the catena is likely to capture the topographically driven variability, providing detailed information with lower effort compared to a grid or random sampling approach. The results also demonstrate the importance of sampling depth. While the surface layer (0-5 cm) is important for investigating loss through surface processes, a complete inventory is needed for long-term studies. At a minimum, sampling should extend to the depth of the deepest tillage operation, but preferential flow paths and bioturbation may carry MPs deeper into the soil profile. Ideally incremental depth sampling is used to characterize the concentration of MPs with depth to provide a full inventory. In this study, the polymer coated fertilizer was broadcast applied, resulting in a relatively uniform horizontal distribution of MPs; however, where fertilizer is banded, sampling must span the full width of the bands to account for the concentrated horizontal distribution of polymer coatings.</w:t>
-      </w:r>
-    </w:p>
-    <w:p>
-      <w:pPr>
-        <w:pStyle w:val="TextBody"/>
-      </w:pPr>
-      <w:r>
-        <w:t xml:space="preserve">Beyond sampling strategy, additional work is needed to examine temporal and spatial patterns of other types and sources of agricultural MPs. Much of the literature on microplastics has focused on soils receiving biosolids, which often contain substantial amounts of plastics. On farms in Manitoba, biosolids are used as a soil amendment only in close proximity to certain wastewater treatment facilities; however, other sources of MPs are used more broadly on-farm (e.g., polymer coated fertilizers, bale wrap, twine, bags/containers). There are also external sources of plastics delivered to agricultural soils through atmospheric deposition or overland flooding</w:t>
-      </w:r>
-      <w:r>
-        <w:t xml:space="preserve"> </w:t>
-      </w:r>
-      <w:r>
-        <w:t xml:space="preserve">(</w:t>
-      </w:r>
-      <w:hyperlink w:anchor="ref-chinyo2026">
-        <w:r>
-          <w:rPr>
-            <w:rStyle w:val="InternetLink"/>
-          </w:rPr>
-          <w:t xml:space="preserve">Chinyo et al., 2026</w:t>
-        </w:r>
-      </w:hyperlink>
-      <w:r>
-        <w:t xml:space="preserve">)</w:t>
-      </w:r>
-      <w:r>
-        <w:t xml:space="preserve">. In these cases, concentrations are likely to be very low, adding further challenges to quantifying and identifying MPs</w:t>
-      </w:r>
-      <w:r>
-        <w:t xml:space="preserve"> </w:t>
-      </w:r>
-      <w:r>
-        <w:t xml:space="preserve">(</w:t>
-      </w:r>
-      <w:hyperlink w:anchor="ref-piehl2018">
-        <w:r>
-          <w:rPr>
-            <w:rStyle w:val="InternetLink"/>
-          </w:rPr>
-          <w:t xml:space="preserve">Piehl et al., 2018</w:t>
-        </w:r>
-      </w:hyperlink>
-      <w:r>
-        <w:t xml:space="preserve">)</w:t>
-      </w:r>
-      <w:r>
-        <w:t xml:space="preserve">. Nonetheless, the dynamic nature observed with the polymer coatings in this study is likely transferable to a wide range of plastic types and sizes.</w:t>
-      </w:r>
-    </w:p>
-    <w:bookmarkEnd w:id="41"/>
-    <w:bookmarkStart w:id="49" w:name="runoff-and-loss"/>
-    <w:p>
-      <w:pPr>
-        <w:pStyle w:val="Heading3"/>
-      </w:pPr>
-      <w:r>
-        <w:t xml:space="preserve">3.2 Runoff and loss</w:t>
-      </w:r>
-    </w:p>
-    <w:p>
-      <w:pPr>
-        <w:pStyle w:val="FirstParagraph"/>
-      </w:pPr>
-      <w:r>
-        <w:t xml:space="preserve">The long-term normal annual precipitation is 527 mm. The year of application (2022) received near-normal precipitation, while the 2023 water year was notably drier, accumulating only 250 mm. In particular, late fall and winter precipitation (October 1 to March 31) was substantially below average, totaling 50 mm in 2023 (</w:t>
-      </w:r>
-      <w:hyperlink w:anchor="fig-discharge">
-        <w:r>
-          <w:rPr>
-            <w:rStyle w:val="InternetLink"/>
-          </w:rPr>
-          <w:t xml:space="preserve">Figure 5</w:t>
-        </w:r>
-      </w:hyperlink>
-      <w:r>
-        <w:t xml:space="preserve">) compared to the long-term average of 141 mm for this period. During the 2023 spring runoff period, the West watershed (5.15 ha) had a higher volume-weighted mean concentration of 0.071 coatings m⁻³, resulting in an estimated 171 total coatings exported despite a lower accumulated runoff volume of 2,424 m³ (</w:t>
-      </w:r>
-      <w:hyperlink w:anchor="tbl-runoff">
-        <w:r>
-          <w:rPr>
-            <w:rStyle w:val="InternetLink"/>
-          </w:rPr>
-          <w:t xml:space="preserve">Table 3</w:t>
-        </w:r>
-      </w:hyperlink>
-      <w:r>
-        <w:t xml:space="preserve">). In contrast, the East watershed (4.16 ha) produced nearly twice the runoff (4,675 m³) but had a lower concentration of 0.027 coatings m⁻³, exporting an estimated 126 coatings (</w:t>
-      </w:r>
-      <w:hyperlink w:anchor="tbl-runoff">
-        <w:r>
-          <w:rPr>
-            <w:rStyle w:val="InternetLink"/>
-          </w:rPr>
-          <w:t xml:space="preserve">Table 3</w:t>
-        </w:r>
-      </w:hyperlink>
-      <w:r>
-        <w:t xml:space="preserve">). Overall, concentration rather than runoff volume was the primary driver of total coatings export between the two watersheds. The manual measurements made as part of this study sampled only a small portion of the runoff event, missing the larger peaks in the hydrograph. By missing peak runoff, these measurements provided a limited overall characterization of both concentration and total coating loss, but do indicate mobility of detectable amounts of microplastics from fertilizer coatings during snowmelt. Additionally, the drier conditions in 2023 resulted in lower runoff volumes, potentially accounting for the small numbers of coatings observed. Future studies should sample across various parts of the hydrograph and across a range of spring snowmelt conditions, including wet and dry years, flashy and subdued hydrographs, and varying frequencies of freeze-thaw cycles. This broader approach would better capture the role of environmental conditions and runoff volumes on the transport and export of polymer coatings and other MPs.</w:t>
-      </w:r>
-    </w:p>
-    <w:tbl>
-      <w:tblPr>
-        <w:tblStyle w:val="Table"/>
-        <w:tblW w:type="pct" w:w="5000"/>
-        <w:tblLayout w:type="fixed"/>
-        <w:tblLook w:firstRow="0" w:lastRow="0" w:firstColumn="0" w:lastColumn="0" w:noHBand="0" w:noVBand="0" w:val="0000"/>
-      </w:tblPr>
-      <w:tblGrid>
-        <w:gridCol w:w="7920"/>
-      </w:tblGrid>
-      <w:tr>
-        <w:tc>
-          <w:tcPr/>
-          <w:bookmarkStart w:id="45" w:name="fig-discharge"/>
+          <w:bookmarkStart w:id="45" w:name="fig-depth"/>
           <w:p>
             <w:pPr>
               <w:pStyle w:val="Compact"/>
@@ -3471,7 +3150,7 @@
                     <a:graphicData uri="http://schemas.openxmlformats.org/drawingml/2006/picture">
                       <pic:pic>
                         <pic:nvPicPr>
-                          <pic:cNvPr descr="index_files/figure-docx/notebooks-04_Discharge-fig-discharge-output-1.png" id="44" name="Picture"/>
+                          <pic:cNvPr descr="index_files/figure-docx/notebooks-soil_sampling-fig-depth-output-1.png" id="44" name="Picture"/>
                           <pic:cNvPicPr>
                             <a:picLocks noChangeArrowheads="1" noChangeAspect="1"/>
                           </pic:cNvPicPr>
@@ -3509,12 +3188,12 @@
               <w:jc w:val="center"/>
             </w:pPr>
             <w:pPr>
-              <w:jc w:val="left"/>
+              <w:jc w:val="start"/>
               <w:spacing w:before="200"/>
               <w:pStyle w:val="ImageCaption"/>
             </w:pPr>
             <w:r>
-              <w:t xml:space="preserve">Figure 5: Discharge for the East and West watersheds during the spring snowmelt period in April 2023. Shaded regions indicate the four sampling periods for polymer coatings.</w:t>
+              <w:t xml:space="preserve">Figure 3: Polymer density (a) and abundance (b) for two sampling depths (0-5 and 5-10 cm) and the combined (0-10 cm) by slope position. Samples were collected on 2023-09-19 and no polymer was detected below 5 cm in the riparian area.</w:t>
             </w:r>
           </w:p>
           <w:bookmarkEnd w:id="45"/>
@@ -3543,9 +3222,142 @@
             <w:rStyle w:val="InternetLink"/>
             <w:vertAlign w:val="subscript"/>
           </w:rPr>
-          <w:t xml:space="preserve">04 Discharage</w:t>
-        </w:r>
-      </w:hyperlink>
+          <w:t xml:space="preserve">03 Soil sampling</w:t>
+        </w:r>
+      </w:hyperlink>
+    </w:p>
+    <w:p>
+      <w:pPr>
+        <w:pStyle w:val="TextBody"/>
+      </w:pPr>
+      <w:r>
+        <w:t xml:space="preserve">The distribution of MPs in soil within agro-ecosystems is dynamic in both space and time, and continued research in this area must account for both dimensions when developing research ideas and sampling strategies. Currently, few guidelines or established sampling protocols are in place</w:t>
+      </w:r>
+      <w:r>
+        <w:t xml:space="preserve"> </w:t>
+      </w:r>
+      <w:r>
+        <w:t xml:space="preserve">(</w:t>
+      </w:r>
+      <w:hyperlink w:anchor="ref-chia2024">
+        <w:r>
+          <w:rPr>
+            <w:rStyle w:val="InternetLink"/>
+          </w:rPr>
+          <w:t xml:space="preserve">Chia et al., 2024</w:t>
+        </w:r>
+      </w:hyperlink>
+      <w:r>
+        <w:t xml:space="preserve">)</w:t>
+      </w:r>
+      <w:r>
+        <w:t xml:space="preserve">. The results of this study suggest that a transect approach along the catena is likely to capture the topographically driven variability, providing detailed information with lower effort compared to a grid or random sampling approach. The results also demonstrate the importance of sampling depth. While the surface layer (0-5 cm) is important for investigating loss through surface processes, a complete inventory is needed for long-term studies. At a minimum, sampling should extend to the depth of the deepest tillage operation, but preferential flow paths and bioturbation may carry MPs deeper into the soil profile. Ideally incremental depth sampling is used to characterize the concentration of MPs with depth to provide a full inventory. In this study, the polymer coated fertilizer was broadcast applied, resulting in a relatively uniform horizontal distribution of MPs; however, where fertilizer is banded, sampling must span the full width of the bands to account for the concentrated horizontal distribution of polymer coatings.</w:t>
+      </w:r>
+    </w:p>
+    <w:p>
+      <w:pPr>
+        <w:pStyle w:val="TextBody"/>
+      </w:pPr>
+      <w:r>
+        <w:t xml:space="preserve">Beyond sampling strategy, additional work is needed to examine temporal and spatial patterns of other types and sources of agricultural MPs. Much of the literature on microplastics has focused on soils receiving biosolids, which often contain substantial amounts of plastics. On farms in Manitoba, biosolids are used as a soil amendment only in close proximity to certain wastewater treatment facilities; however, other sources of MPs are used more broadly on-farm (e.g., polymer coated fertilizers, bale wrap, twine, bags/containers). There are also external sources of plastics delivered to agricultural soils through atmospheric deposition or overland flooding</w:t>
+      </w:r>
+      <w:r>
+        <w:t xml:space="preserve"> </w:t>
+      </w:r>
+      <w:r>
+        <w:t xml:space="preserve">(</w:t>
+      </w:r>
+      <w:hyperlink w:anchor="ref-chinyo2026">
+        <w:r>
+          <w:rPr>
+            <w:rStyle w:val="InternetLink"/>
+          </w:rPr>
+          <w:t xml:space="preserve">Chinyo et al., 2026</w:t>
+        </w:r>
+      </w:hyperlink>
+      <w:r>
+        <w:t xml:space="preserve">)</w:t>
+      </w:r>
+      <w:r>
+        <w:t xml:space="preserve">. In these cases, concentrations are likely to be very low, adding further challenges to quantifying and identifying MPs</w:t>
+      </w:r>
+      <w:r>
+        <w:t xml:space="preserve"> </w:t>
+      </w:r>
+      <w:r>
+        <w:t xml:space="preserve">(</w:t>
+      </w:r>
+      <w:hyperlink w:anchor="ref-piehl2018">
+        <w:r>
+          <w:rPr>
+            <w:rStyle w:val="InternetLink"/>
+          </w:rPr>
+          <w:t xml:space="preserve">Piehl et al., 2018</w:t>
+        </w:r>
+      </w:hyperlink>
+      <w:r>
+        <w:t xml:space="preserve">)</w:t>
+      </w:r>
+      <w:r>
+        <w:t xml:space="preserve">. Nonetheless, the dynamic nature observed with the polymer coatings in this study is likely transferable to a wide range of plastic types and sizes.</w:t>
+      </w:r>
+    </w:p>
+    <w:bookmarkEnd w:id="47"/>
+    <w:bookmarkStart w:id="53" w:name="runoff-and-loss"/>
+    <w:p>
+      <w:pPr>
+        <w:pStyle w:val="Heading3"/>
+      </w:pPr>
+      <w:r>
+        <w:t xml:space="preserve">3.2 Runoff and loss</w:t>
+      </w:r>
+    </w:p>
+    <w:p>
+      <w:pPr>
+        <w:pStyle w:val="FirstParagraph"/>
+      </w:pPr>
+      <w:r>
+        <w:t xml:space="preserve">The long-term normal annual precipitation is 527 mm. The year of application (2022) received near-normal precipitation, while the 2023 water year was notably drier, accumulating only 250 mm. In particular, late fall and winter precipitation (October 1 to March 31) was substantially below average, totaling 50 mm in 2023 (</w:t>
+      </w:r>
+      <w:hyperlink w:anchor="suppfig-climate-normals">
+        <w:r>
+          <w:rPr>
+            <w:rStyle w:val="InternetLink"/>
+          </w:rPr>
+          <w:t xml:space="preserve">Figure S1</w:t>
+        </w:r>
+      </w:hyperlink>
+      <w:r>
+        <w:t xml:space="preserve"> </w:t>
+      </w:r>
+      <w:r>
+        <w:t xml:space="preserve">and</w:t>
+      </w:r>
+      <w:r>
+        <w:t xml:space="preserve"> </w:t>
+      </w:r>
+      <w:hyperlink w:anchor="suppfig-weather-climate">
+        <w:r>
+          <w:rPr>
+            <w:rStyle w:val="InternetLink"/>
+          </w:rPr>
+          <w:t xml:space="preserve">Figure S2</w:t>
+        </w:r>
+      </w:hyperlink>
+      <w:r>
+        <w:t xml:space="preserve">) compared to the long-term average of 141 mm for this period. During the 2023 spring runoff period, the West watershed (5.15 ha) had a higher volume-weighted mean concentration of 0.071 coatings m⁻³, resulting in an estimated 171 total coatings exported despite a lower accumulated runoff volume of 2,424 m³ (</w:t>
+      </w:r>
+      <w:hyperlink w:anchor="fig-discharge">
+        <w:r>
+          <w:rPr>
+            <w:rStyle w:val="InternetLink"/>
+          </w:rPr>
+          <w:t xml:space="preserve">Figure 4</w:t>
+        </w:r>
+      </w:hyperlink>
+      <w:r>
+        <w:t xml:space="preserve">). In contrast, the East watershed (4.16 ha) produced nearly twice the runoff (4,675 m³) but had a lower concentration of 0.027 coatings m⁻³, exporting an estimated 126 coatings. Overall, concentration rather than runoff volume was the primary driver of total coatings export between the two watersheds. The manual measurements made as part of this study sampled only a small portion of the runoff event, missing the larger peaks in the hydrograph. By missing peak runoff, these measurements provided a limited overall characterization of both concentration and total coating loss, but do indicate mobility of detectable amounts of microplastics from fertilizer coatings during snowmelt. Additionally, the drier conditions in 2023 resulted in lower runoff volumes, potentially accounting for the small numbers of coatings observed. Future studies should sample across various parts of the hydrograph and across a range of spring snowmelt conditions, including wet and dry years, flashy and subdued hydrographs, and varying frequencies of freeze-thaw cycles. This broader approach would better capture the role of environmental conditions and runoff volumes on the transport and export of polymer coatings and other MPs.</w:t>
+      </w:r>
     </w:p>
     <w:tbl>
       <w:tblPr>
@@ -3560,268 +3372,69 @@
       <w:tr>
         <w:tc>
           <w:tcPr/>
-          <w:bookmarkStart w:id="47" w:name="tbl-runoff"/>
+          <w:bookmarkStart w:id="51" w:name="fig-discharge"/>
+          <w:p>
+            <w:pPr>
+              <w:pStyle w:val="Compact"/>
+              <w:jc w:val="center"/>
+            </w:pPr>
+            <w:r>
+              <w:drawing>
+                <wp:inline>
+                  <wp:extent cx="5943600" cy="4245428"/>
+                  <wp:effectExtent b="0" l="0" r="0" t="0"/>
+                  <wp:docPr descr="" title="" id="49" name="Picture"/>
+                  <a:graphic>
+                    <a:graphicData uri="http://schemas.openxmlformats.org/drawingml/2006/picture">
+                      <pic:pic>
+                        <pic:nvPicPr>
+                          <pic:cNvPr descr="index_files/figure-docx/notebooks-04_Discharge-fig-discharge-output-1.png" id="50" name="Picture"/>
+                          <pic:cNvPicPr>
+                            <a:picLocks noChangeArrowheads="1" noChangeAspect="1"/>
+                          </pic:cNvPicPr>
+                        </pic:nvPicPr>
+                        <pic:blipFill>
+                          <a:blip r:embed="rId48"/>
+                          <a:stretch>
+                            <a:fillRect/>
+                          </a:stretch>
+                        </pic:blipFill>
+                        <pic:spPr bwMode="auto">
+                          <a:xfrm>
+                            <a:off x="0" y="0"/>
+                            <a:ext cx="5943600" cy="4245428"/>
+                          </a:xfrm>
+                          <a:prstGeom prst="rect">
+                            <a:avLst/>
+                          </a:prstGeom>
+                          <a:noFill/>
+                          <a:ln w="9525">
+                            <a:noFill/>
+                            <a:headEnd/>
+                            <a:tailEnd/>
+                          </a:ln>
+                        </pic:spPr>
+                      </pic:pic>
+                    </a:graphicData>
+                  </a:graphic>
+                </wp:inline>
+              </w:drawing>
+            </w:r>
+          </w:p>
           <w:p>
             <w:pPr>
               <w:jc w:val="center"/>
             </w:pPr>
             <w:pPr>
-              <w:jc w:val="left"/>
+              <w:jc w:val="start"/>
               <w:spacing w:before="200"/>
               <w:pStyle w:val="ImageCaption"/>
             </w:pPr>
             <w:r>
-              <w:t xml:space="preserve">Table 3: Estimated total polymer coating export from West and East watersheds over the course of snowmelt in 2023, based on accumulated runoff volume and volume-weighted mean concentration.</w:t>
+              <w:t xml:space="preserve">Figure 4: Discharge for the East and West watersheds during the spring snowmelt period in April 2023. Shaded regions indicate the four sampling periods for polymer coatings.</w:t>
             </w:r>
           </w:p>
-          <w:tbl>
-            <w:tblPr>
-              <w:tblStyle w:val="Table"/>
-              <w:tblW w:type="auto" w:w="0"/>
-              <w:tblLook w:firstRow="1" w:lastRow="1" w:firstColumn="0" w:lastColumn="0" w:noHBand="0" w:noVBand="0" w:val="0020"/>
-            </w:tblPr>
-            <w:tblGrid>
-              <w:gridCol w:w="1584"/>
-              <w:gridCol w:w="1584"/>
-              <w:gridCol w:w="1584"/>
-              <w:gridCol w:w="1584"/>
-              <w:gridCol w:w="1584"/>
-            </w:tblGrid>
-            <w:tr>
-              <w:trPr>
-                <w:tblHeader w:val="on"/>
-              </w:trPr>
-              <w:tc>
-                <w:tcPr/>
-                <w:p>
-                  <w:pPr>
-                    <w:pStyle w:val="Compact"/>
-                    <w:jc w:val="center"/>
-                  </w:pPr>
-                  <w:r>
-                    <w:t xml:space="preserve">Watershed</w:t>
-                  </w:r>
-                </w:p>
-              </w:tc>
-              <w:tc>
-                <w:tcPr/>
-                <w:p>
-                  <w:pPr>
-                    <w:pStyle w:val="Compact"/>
-                    <w:jc w:val="center"/>
-                  </w:pPr>
-                  <w:r>
-                    <w:t xml:space="preserve">Area (ha)</w:t>
-                  </w:r>
-                </w:p>
-              </w:tc>
-              <w:tc>
-                <w:tcPr/>
-                <w:p>
-                  <w:pPr>
-                    <w:pStyle w:val="Compact"/>
-                    <w:jc w:val="center"/>
-                  </w:pPr>
-                  <w:r>
-                    <w:t xml:space="preserve">Accumulated runoff (m</w:t>
-                  </w:r>
-                  <w:r>
-                    <w:t xml:space="preserve">3</w:t>
-                  </w:r>
-                  <w:r>
-                    <w:t xml:space="preserve">)</w:t>
-                  </w:r>
-                </w:p>
-              </w:tc>
-              <w:tc>
-                <w:tcPr/>
-                <w:p>
-                  <w:pPr>
-                    <w:pStyle w:val="Compact"/>
-                    <w:jc w:val="center"/>
-                  </w:pPr>
-                  <w:r>
-                    <w:t xml:space="preserve">Concentration (Coatings m</w:t>
-                  </w:r>
-                  <w:r>
-                    <w:t xml:space="preserve">-3</w:t>
-                  </w:r>
-                  <w:r>
-                    <w:t xml:space="preserve">)</w:t>
-                  </w:r>
-                  <w:r>
-                    <w:rPr>
-                      <w:vertAlign w:val="superscript"/>
-                    </w:rPr>
-                    <w:t xml:space="preserve">*</w:t>
-                  </w:r>
-                </w:p>
-              </w:tc>
-              <w:tc>
-                <w:tcPr/>
-                <w:p>
-                  <w:pPr>
-                    <w:pStyle w:val="Compact"/>
-                    <w:jc w:val="center"/>
-                  </w:pPr>
-                  <w:r>
-                    <w:t xml:space="preserve">Total coatings exported</w:t>
-                  </w:r>
-                </w:p>
-              </w:tc>
-            </w:tr>
-            <w:tr>
-              <w:tc>
-                <w:tcPr/>
-                <w:p>
-                  <w:pPr>
-                    <w:pStyle w:val="Compact"/>
-                    <w:jc w:val="center"/>
-                  </w:pPr>
-                  <w:r>
-                    <w:t xml:space="preserve">West</w:t>
-                  </w:r>
-                </w:p>
-              </w:tc>
-              <w:tc>
-                <w:tcPr/>
-                <w:p>
-                  <w:pPr>
-                    <w:pStyle w:val="Compact"/>
-                    <w:jc w:val="center"/>
-                  </w:pPr>
-                  <w:r>
-                    <w:t xml:space="preserve">5.15</w:t>
-                  </w:r>
-                </w:p>
-              </w:tc>
-              <w:tc>
-                <w:tcPr/>
-                <w:p>
-                  <w:pPr>
-                    <w:pStyle w:val="Compact"/>
-                    <w:jc w:val="center"/>
-                  </w:pPr>
-                  <w:r>
-                    <w:t xml:space="preserve">2,424</w:t>
-                  </w:r>
-                </w:p>
-              </w:tc>
-              <w:tc>
-                <w:tcPr/>
-                <w:p>
-                  <w:pPr>
-                    <w:pStyle w:val="Compact"/>
-                    <w:jc w:val="center"/>
-                  </w:pPr>
-                  <w:r>
-                    <w:t xml:space="preserve">0.071</w:t>
-                  </w:r>
-                </w:p>
-              </w:tc>
-              <w:tc>
-                <w:tcPr/>
-                <w:p>
-                  <w:pPr>
-                    <w:pStyle w:val="Compact"/>
-                    <w:jc w:val="center"/>
-                  </w:pPr>
-                  <w:r>
-                    <w:t xml:space="preserve">171</w:t>
-                  </w:r>
-                </w:p>
-              </w:tc>
-            </w:tr>
-            <w:tr>
-              <w:tc>
-                <w:tcPr/>
-                <w:p>
-                  <w:pPr>
-                    <w:pStyle w:val="Compact"/>
-                    <w:jc w:val="center"/>
-                  </w:pPr>
-                  <w:r>
-                    <w:t xml:space="preserve">East</w:t>
-                  </w:r>
-                </w:p>
-              </w:tc>
-              <w:tc>
-                <w:tcPr/>
-                <w:p>
-                  <w:pPr>
-                    <w:pStyle w:val="Compact"/>
-                    <w:jc w:val="center"/>
-                  </w:pPr>
-                  <w:r>
-                    <w:t xml:space="preserve">4.16</w:t>
-                  </w:r>
-                </w:p>
-              </w:tc>
-              <w:tc>
-                <w:tcPr/>
-                <w:p>
-                  <w:pPr>
-                    <w:pStyle w:val="Compact"/>
-                    <w:jc w:val="center"/>
-                  </w:pPr>
-                  <w:r>
-                    <w:t xml:space="preserve">4,675</w:t>
-                  </w:r>
-                </w:p>
-              </w:tc>
-              <w:tc>
-                <w:tcPr/>
-                <w:p>
-                  <w:pPr>
-                    <w:pStyle w:val="Compact"/>
-                    <w:jc w:val="center"/>
-                  </w:pPr>
-                  <w:r>
-                    <w:t xml:space="preserve">0.027</w:t>
-                  </w:r>
-                </w:p>
-              </w:tc>
-              <w:tc>
-                <w:tcPr/>
-                <w:p>
-                  <w:pPr>
-                    <w:pStyle w:val="Compact"/>
-                    <w:jc w:val="center"/>
-                  </w:pPr>
-                  <w:r>
-                    <w:t xml:space="preserve">126</w:t>
-                  </w:r>
-                </w:p>
-              </w:tc>
-            </w:tr>
-            <w:tr>
-              <w:tc>
-                <w:tcPr>
-                  <w:gridSpan w:val="5"/>
-                </w:tcPr>
-                <w:p>
-                  <w:pPr>
-                    <w:pStyle w:val="Compact"/>
-                    <w:jc w:val="center"/>
-                  </w:pPr>
-                  <w:r>
-                    <w:rPr>
-                      <w:vertAlign w:val="superscript"/>
-                    </w:rPr>
-                    <w:t xml:space="preserve">*</w:t>
-                  </w:r>
-                  <w:r>
-                    <w:t xml:space="preserve"> </w:t>
-                  </w:r>
-                  <w:r>
-                    <w:t xml:space="preserve">Volume-weighted mean concentration</w:t>
-                  </w:r>
-                </w:p>
-              </w:tc>
-            </w:tr>
-          </w:tbl>
-          <w:bookmarkEnd w:id="47"/>
-          <w:p/>
+          <w:bookmarkEnd w:id="51"/>
         </w:tc>
       </w:tr>
     </w:tbl>
@@ -3841,7 +3454,7 @@
         </w:rPr>
         <w:t xml:space="preserve"> </w:t>
       </w:r>
-      <w:hyperlink r:id="rId48">
+      <w:hyperlink r:id="rId52">
         <w:r>
           <w:rPr>
             <w:rStyle w:val="InternetLink"/>
@@ -3929,9 +3542,9 @@
         <w:t xml:space="preserve">, suggesting that MPs likely behave differently than soil particles during runoff events. However, multi-year in-field observations are needed to validate whether these patterns hold under field conditions across a range of hydrologic and climatic conditions. Field-based studies will help clarify MP transport dynamics and identify management strategies that are effective not only for MP mitigation but also for controlling erosion and nutrient loss.</w:t>
       </w:r>
     </w:p>
-    <w:bookmarkEnd w:id="49"/>
-    <w:bookmarkEnd w:id="50"/>
-    <w:bookmarkStart w:id="51" w:name="conclusions"/>
+    <w:bookmarkEnd w:id="53"/>
+    <w:bookmarkEnd w:id="54"/>
+    <w:bookmarkStart w:id="55" w:name="conclusions"/>
     <w:p>
       <w:pPr>
         <w:pStyle w:val="Heading2"/>
@@ -3948,8 +3561,8 @@
         <w:t xml:space="preserve">Polymer coatings from slow-release fertilizers showed clear spatial and temporal dynamics, with evidence of downslope movement and export to downstream environments, demonstrating that agricultural soils can serve as a long-term source of MPs. Soil sampling and edge of field runoff designs and research questions must account for this spatial and temporal variability, and developing best practices for sampling MPs in agricultural settings should be a research priority. The findings of this study are likely applicable to other types of agricultural plastics, which may show similar transport dynamics. Edge-of-field sampling in cold climates presents particular challenges, as low concentrations require filtering large volumes of runoff and freeze-thaw conditions and debris impede water flow through sampling equipment, highlighting the need for improved sampling approaches that can reliably quantify MP export under these conditions. As plastic inputs to agricultural landscapes continue to grow, whether from on-farm use or external sources, characterizing and managing MP movement through the landscape will be essential to effectively quantify and mitigate their broader environmental impact.</w:t>
       </w:r>
     </w:p>
-    <w:bookmarkEnd w:id="51"/>
-    <w:bookmarkStart w:id="52" w:name="acknowledgments"/>
+    <w:bookmarkEnd w:id="55"/>
+    <w:bookmarkStart w:id="56" w:name="acknowledgments"/>
     <w:p>
       <w:pPr>
         <w:pStyle w:val="Heading2"/>
@@ -3966,8 +3579,8 @@
         <w:t xml:space="preserve">Special thanks and recognition for the field and technical support from C Jackson and the cooperating producers at the South Tobacco Creek twin watershed site.</w:t>
       </w:r>
     </w:p>
-    <w:bookmarkEnd w:id="52"/>
-    <w:bookmarkStart w:id="59" w:name="statements-and-declarations"/>
+    <w:bookmarkEnd w:id="56"/>
+    <w:bookmarkStart w:id="63" w:name="statements-and-declarations"/>
     <w:p>
       <w:pPr>
         <w:pStyle w:val="Heading2"/>
@@ -3976,7 +3589,7 @@
         <w:t xml:space="preserve">Statements and declarations</w:t>
       </w:r>
     </w:p>
-    <w:bookmarkStart w:id="53" w:name="funding"/>
+    <w:bookmarkStart w:id="57" w:name="funding"/>
     <w:p>
       <w:pPr>
         <w:pStyle w:val="Heading3"/>
@@ -3993,8 +3606,8 @@
         <w:t xml:space="preserve">This research was supported by the Agriculture and Agri-Food Canada Living Laboratories Initiative.</w:t>
       </w:r>
     </w:p>
-    <w:bookmarkEnd w:id="53"/>
-    <w:bookmarkStart w:id="54" w:name="competing-interests"/>
+    <w:bookmarkEnd w:id="57"/>
+    <w:bookmarkStart w:id="58" w:name="competing-interests"/>
     <w:p>
       <w:pPr>
         <w:pStyle w:val="Heading3"/>
@@ -4011,8 +3624,8 @@
         <w:t xml:space="preserve">The authors have no competing interests to declare that are relevant to the content of this article.</w:t>
       </w:r>
     </w:p>
-    <w:bookmarkEnd w:id="54"/>
-    <w:bookmarkStart w:id="57" w:name="data-and-code-availability"/>
+    <w:bookmarkEnd w:id="58"/>
+    <w:bookmarkStart w:id="61" w:name="data-and-code-availability"/>
     <w:p>
       <w:pPr>
         <w:pStyle w:val="Heading3"/>
@@ -4026,12 +3639,12 @@
         <w:pStyle w:val="FirstParagraph"/>
       </w:pPr>
       <w:r>
-        <w:t xml:space="preserve">Data and source code for analysis and manuscript available on GitHub:</w:t>
-      </w:r>
-      <w:r>
-        <w:t xml:space="preserve"> </w:t>
-      </w:r>
-      <w:hyperlink r:id="rId55">
+        <w:t xml:space="preserve">All data and source code used in this study are publicly available on GitHub at</w:t>
+      </w:r>
+      <w:r>
+        <w:t xml:space="preserve"> </w:t>
+      </w:r>
+      <w:hyperlink r:id="rId59">
         <w:r>
           <w:rPr>
             <w:rStyle w:val="InternetLink"/>
@@ -4039,18 +3652,19 @@
           <w:t xml:space="preserve">https://github.com/alex-koiter/soil-plastics</w:t>
         </w:r>
       </w:hyperlink>
-    </w:p>
-    <w:p>
-      <w:pPr>
-        <w:pStyle w:val="TextBody"/>
-      </w:pPr>
-      <w:r>
-        <w:t xml:space="preserve">Additional information, including analytical notebooks with details of the analysis and intermediate steps, is available online:</w:t>
-      </w:r>
-      <w:r>
-        <w:t xml:space="preserve"> </w:t>
-      </w:r>
-      <w:hyperlink r:id="rId56">
+      <w:r>
+        <w:t xml:space="preserve">. An interactive online version of the manuscript, including analytical notebooks with details of the analysis and intermediate computational steps, is</w:t>
+      </w:r>
+      <w:r>
+        <w:t xml:space="preserve"> </w:t>
+      </w:r>
+      <w:r>
+        <w:t xml:space="preserve">available at</w:t>
+      </w:r>
+      <w:r>
+        <w:t xml:space="preserve"> </w:t>
+      </w:r>
+      <w:hyperlink r:id="rId60">
         <w:r>
           <w:rPr>
             <w:rStyle w:val="InternetLink"/>
@@ -4059,8 +3673,8 @@
         </w:r>
       </w:hyperlink>
     </w:p>
-    <w:bookmarkEnd w:id="57"/>
-    <w:bookmarkStart w:id="58" w:name="author-contributions"/>
+    <w:bookmarkEnd w:id="61"/>
+    <w:bookmarkStart w:id="62" w:name="author-contributions"/>
     <w:p>
       <w:pPr>
         <w:pStyle w:val="Heading3"/>
@@ -4132,9 +3746,9 @@
         <w:t xml:space="preserve">: Conceptualization; Funding acquisition; Methodology; Investigation; Data curation; Formal analysis; Writing - Original Draft; Writing – review and editing; Project administration</w:t>
       </w:r>
     </w:p>
-    <w:bookmarkEnd w:id="58"/>
-    <w:bookmarkEnd w:id="59"/>
-    <w:bookmarkStart w:id="128" w:name="references"/>
+    <w:bookmarkEnd w:id="62"/>
+    <w:bookmarkEnd w:id="63"/>
+    <w:bookmarkStart w:id="132" w:name="references"/>
     <w:p>
       <w:pPr>
         <w:pStyle w:val="Heading2"/>
@@ -4143,8 +3757,8 @@
         <w:t xml:space="preserve">References</w:t>
       </w:r>
     </w:p>
-    <w:bookmarkStart w:id="127" w:name="refs"/>
-    <w:bookmarkStart w:id="61" w:name="ref-agricultureandagri-foodcanada2011"/>
+    <w:bookmarkStart w:id="131" w:name="refs"/>
+    <w:bookmarkStart w:id="65" w:name="ref-agricultureandagri-foodcanada2011"/>
     <w:p>
       <w:pPr>
         <w:pStyle w:val="Bibliography"/>
@@ -4155,7 +3769,7 @@
       <w:r>
         <w:t xml:space="preserve"> </w:t>
       </w:r>
-      <w:hyperlink r:id="rId60">
+      <w:hyperlink r:id="rId64">
         <w:r>
           <w:rPr>
             <w:rStyle w:val="InternetLink"/>
@@ -4164,8 +3778,8 @@
         </w:r>
       </w:hyperlink>
     </w:p>
-    <w:bookmarkEnd w:id="61"/>
-    <w:bookmarkStart w:id="63" w:name="ref-anderson2017"/>
+    <w:bookmarkEnd w:id="65"/>
+    <w:bookmarkStart w:id="67" w:name="ref-anderson2017"/>
     <w:p>
       <w:pPr>
         <w:pStyle w:val="Bibliography"/>
@@ -4176,7 +3790,7 @@
       <w:r>
         <w:t xml:space="preserve"> </w:t>
       </w:r>
-      <w:hyperlink r:id="rId62">
+      <w:hyperlink r:id="rId66">
         <w:r>
           <w:rPr>
             <w:rStyle w:val="InternetLink"/>
@@ -4185,8 +3799,8 @@
         </w:r>
       </w:hyperlink>
     </w:p>
-    <w:bookmarkEnd w:id="63"/>
-    <w:bookmarkStart w:id="65" w:name="ref-astm_d5242_92"/>
+    <w:bookmarkEnd w:id="67"/>
+    <w:bookmarkStart w:id="69" w:name="ref-astm_d5242_92"/>
     <w:p>
       <w:pPr>
         <w:pStyle w:val="Bibliography"/>
@@ -4197,7 +3811,7 @@
       <w:r>
         <w:t xml:space="preserve"> </w:t>
       </w:r>
-      <w:hyperlink r:id="rId64">
+      <w:hyperlink r:id="rId68">
         <w:r>
           <w:rPr>
             <w:rStyle w:val="InternetLink"/>
@@ -4206,19 +3820,19 @@
         </w:r>
       </w:hyperlink>
     </w:p>
-    <w:bookmarkEnd w:id="65"/>
-    <w:bookmarkStart w:id="67" w:name="ref-brooks2017"/>
+    <w:bookmarkEnd w:id="69"/>
+    <w:bookmarkStart w:id="71" w:name="ref-brooks2017"/>
     <w:p>
       <w:pPr>
         <w:pStyle w:val="Bibliography"/>
       </w:pPr>
       <w:r>
-        <w:t xml:space="preserve">Brooks, Mollie,E., Kristensen, K., Benthem, Koen,J.,van., Magnusson, A., Berg, Casper,W., Nielsen, A., Skaug, Hans,J., Mächler, M., Bolker, Benjamin,M., 2017. glmmTMB balances speed and flexibility among packages for zero-inflated generalized linear mixed modeling. The R Journal 9, 378.</w:t>
-      </w:r>
-      <w:r>
-        <w:t xml:space="preserve"> </w:t>
-      </w:r>
-      <w:hyperlink r:id="rId66">
+        <w:t xml:space="preserve">Brooks, Mollie,E., Kristensen, K., Benthem, Koen,J.,van., Magnusson, A., Berg, Casper,W., Nielsen, A., Skaug, Hans,J., Mächler, M., Bolker, Benjamin,M., 2017. glmmTMB Balances Speed and Flexibility Among Packages for Zero-inflated Generalized Linear Mixed Modeling. The R Journal 9, 378.</w:t>
+      </w:r>
+      <w:r>
+        <w:t xml:space="preserve"> </w:t>
+      </w:r>
+      <w:hyperlink r:id="rId70">
         <w:r>
           <w:rPr>
             <w:rStyle w:val="InternetLink"/>
@@ -4227,19 +3841,19 @@
         </w:r>
       </w:hyperlink>
     </w:p>
-    <w:bookmarkEnd w:id="67"/>
-    <w:bookmarkStart w:id="69" w:name="ref-chia2024"/>
+    <w:bookmarkEnd w:id="71"/>
+    <w:bookmarkStart w:id="73" w:name="ref-chia2024"/>
     <w:p>
       <w:pPr>
         <w:pStyle w:val="Bibliography"/>
       </w:pPr>
       <w:r>
-        <w:t xml:space="preserve">Chia, R.W., Lee, J.-Y., Cha, J., Rodríguez-Seijo, A., 2024. Methods of soil sampling for microplastic analysis: A review. Environmental Chemistry Letters 22, 227–238.</w:t>
-      </w:r>
-      <w:r>
-        <w:t xml:space="preserve"> </w:t>
-      </w:r>
-      <w:hyperlink r:id="rId68">
+        <w:t xml:space="preserve">Chia, R.W., Lee, J.-Y., Cha, J., Rodríguez-Seijo, A., 2024. Methods of soil sampling for microplastic analysis: a review. Environmental Chemistry Letters 22, 227–238.</w:t>
+      </w:r>
+      <w:r>
+        <w:t xml:space="preserve"> </w:t>
+      </w:r>
+      <w:hyperlink r:id="rId72">
         <w:r>
           <w:rPr>
             <w:rStyle w:val="InternetLink"/>
@@ -4248,8 +3862,8 @@
         </w:r>
       </w:hyperlink>
     </w:p>
-    <w:bookmarkEnd w:id="69"/>
-    <w:bookmarkStart w:id="71" w:name="ref-chinyo2026"/>
+    <w:bookmarkEnd w:id="73"/>
+    <w:bookmarkStart w:id="75" w:name="ref-chinyo2026"/>
     <w:p>
       <w:pPr>
         <w:pStyle w:val="Bibliography"/>
@@ -4260,7 +3874,7 @@
       <w:r>
         <w:t xml:space="preserve"> </w:t>
       </w:r>
-      <w:hyperlink r:id="rId70">
+      <w:hyperlink r:id="rId74">
         <w:r>
           <w:rPr>
             <w:rStyle w:val="InternetLink"/>
@@ -4269,8 +3883,8 @@
         </w:r>
       </w:hyperlink>
     </w:p>
-    <w:bookmarkEnd w:id="71"/>
-    <w:bookmarkStart w:id="73" w:name="ref-crossman2020"/>
+    <w:bookmarkEnd w:id="75"/>
+    <w:bookmarkStart w:id="77" w:name="ref-crossman2020"/>
     <w:p>
       <w:pPr>
         <w:pStyle w:val="Bibliography"/>
@@ -4281,7 +3895,7 @@
       <w:r>
         <w:t xml:space="preserve"> </w:t>
       </w:r>
-      <w:hyperlink r:id="rId72">
+      <w:hyperlink r:id="rId76">
         <w:r>
           <w:rPr>
             <w:rStyle w:val="InternetLink"/>
@@ -4290,19 +3904,19 @@
         </w:r>
       </w:hyperlink>
     </w:p>
-    <w:bookmarkEnd w:id="73"/>
-    <w:bookmarkStart w:id="75" w:name="ref-e.lazerte2018"/>
+    <w:bookmarkEnd w:id="77"/>
+    <w:bookmarkStart w:id="79" w:name="ref-e.lazerte2018"/>
     <w:p>
       <w:pPr>
         <w:pStyle w:val="Bibliography"/>
       </w:pPr>
       <w:r>
-        <w:t xml:space="preserve">E. LaZerte, S., Albers, S., 2018. Weathercan: Download and format weather data from environment and climate change canada. The Journal of Open Source Software 3, 571.</w:t>
-      </w:r>
-      <w:r>
-        <w:t xml:space="preserve"> </w:t>
-      </w:r>
-      <w:hyperlink r:id="rId74">
+        <w:t xml:space="preserve">E. LaZerte, S., Albers, S., 2018. weathercan: Download and format weather data from Environment and Climate Change Canada. The Journal of Open Source Software 3, 571.</w:t>
+      </w:r>
+      <w:r>
+        <w:t xml:space="preserve"> </w:t>
+      </w:r>
+      <w:hyperlink r:id="rId78">
         <w:r>
           <w:rPr>
             <w:rStyle w:val="InternetLink"/>
@@ -4311,8 +3925,8 @@
         </w:r>
       </w:hyperlink>
     </w:p>
-    <w:bookmarkEnd w:id="75"/>
-    <w:bookmarkStart w:id="77" w:name="X314a104b7afaf0862b1b73f26445508a1e6fc28"/>
+    <w:bookmarkEnd w:id="79"/>
+    <w:bookmarkStart w:id="81" w:name="X314a104b7afaf0862b1b73f26445508a1e6fc28"/>
     <w:p>
       <w:pPr>
         <w:pStyle w:val="Bibliography"/>
@@ -4323,7 +3937,7 @@
       <w:r>
         <w:t xml:space="preserve"> </w:t>
       </w:r>
-      <w:hyperlink r:id="rId76">
+      <w:hyperlink r:id="rId80">
         <w:r>
           <w:rPr>
             <w:rStyle w:val="InternetLink"/>
@@ -4332,8 +3946,8 @@
         </w:r>
       </w:hyperlink>
     </w:p>
-    <w:bookmarkEnd w:id="77"/>
-    <w:bookmarkStart w:id="79" w:name="X58f871d41ef90e7d5d6faf67b668dadba215eb4"/>
+    <w:bookmarkEnd w:id="81"/>
+    <w:bookmarkStart w:id="83" w:name="X58f871d41ef90e7d5d6faf67b668dadba215eb4"/>
     <w:p>
       <w:pPr>
         <w:pStyle w:val="Bibliography"/>
@@ -4344,7 +3958,7 @@
       <w:r>
         <w:t xml:space="preserve"> </w:t>
       </w:r>
-      <w:hyperlink r:id="rId78">
+      <w:hyperlink r:id="rId82">
         <w:r>
           <w:rPr>
             <w:rStyle w:val="InternetLink"/>
@@ -4353,8 +3967,8 @@
         </w:r>
       </w:hyperlink>
     </w:p>
-    <w:bookmarkEnd w:id="79"/>
-    <w:bookmarkStart w:id="81" w:name="ref-fellows2023"/>
+    <w:bookmarkEnd w:id="83"/>
+    <w:bookmarkStart w:id="85" w:name="ref-fellows2023"/>
     <w:p>
       <w:pPr>
         <w:pStyle w:val="Bibliography"/>
@@ -4365,7 +3979,7 @@
       <w:r>
         <w:t xml:space="preserve"> </w:t>
       </w:r>
-      <w:hyperlink r:id="rId80">
+      <w:hyperlink r:id="rId84">
         <w:r>
           <w:rPr>
             <w:rStyle w:val="InternetLink"/>
@@ -4374,8 +3988,8 @@
         </w:r>
       </w:hyperlink>
     </w:p>
-    <w:bookmarkEnd w:id="81"/>
-    <w:bookmarkStart w:id="83" w:name="ref-fox2019"/>
+    <w:bookmarkEnd w:id="85"/>
+    <w:bookmarkStart w:id="87" w:name="ref-fox2019"/>
     <w:p>
       <w:pPr>
         <w:pStyle w:val="Bibliography"/>
@@ -4407,7 +4021,7 @@
       <w:r>
         <w:t xml:space="preserve"> </w:t>
       </w:r>
-      <w:hyperlink r:id="rId82">
+      <w:hyperlink r:id="rId86">
         <w:r>
           <w:rPr>
             <w:rStyle w:val="InternetLink"/>
@@ -4416,8 +4030,8 @@
         </w:r>
       </w:hyperlink>
     </w:p>
-    <w:bookmarkEnd w:id="83"/>
-    <w:bookmarkStart w:id="85" w:name="ref-hartig2022"/>
+    <w:bookmarkEnd w:id="87"/>
+    <w:bookmarkStart w:id="89" w:name="ref-hartig2022"/>
     <w:p>
       <w:pPr>
         <w:pStyle w:val="Bibliography"/>
@@ -4428,7 +4042,7 @@
       <w:r>
         <w:t xml:space="preserve"> </w:t>
       </w:r>
-      <w:hyperlink r:id="rId84">
+      <w:hyperlink r:id="rId88">
         <w:r>
           <w:rPr>
             <w:rStyle w:val="InternetLink"/>
@@ -4437,19 +4051,19 @@
         </w:r>
       </w:hyperlink>
     </w:p>
-    <w:bookmarkEnd w:id="85"/>
-    <w:bookmarkStart w:id="87" w:name="ref-isakov2025"/>
+    <w:bookmarkEnd w:id="89"/>
+    <w:bookmarkStart w:id="91" w:name="ref-isakov2025"/>
     <w:p>
       <w:pPr>
         <w:pStyle w:val="Bibliography"/>
       </w:pPr>
       <w:r>
-        <w:t xml:space="preserve">Isakov, V., Vlasova, E., Forer, V., Kenny, J., Lyulin, S., 2025. Analysis of slow-released fertilisers as a source of microplastics. Land 14, 38.</w:t>
-      </w:r>
-      <w:r>
-        <w:t xml:space="preserve"> </w:t>
-      </w:r>
-      <w:hyperlink r:id="rId86">
+        <w:t xml:space="preserve">Isakov, V., Vlasova, E., Forer, V., Kenny, J., Lyulin, S., 2025. Analysis of Slow-Released Fertilisers as a Source of Microplastics. Land 14, 38.</w:t>
+      </w:r>
+      <w:r>
+        <w:t xml:space="preserve"> </w:t>
+      </w:r>
+      <w:hyperlink r:id="rId90">
         <w:r>
           <w:rPr>
             <w:rStyle w:val="InternetLink"/>
@@ -4458,8 +4072,8 @@
         </w:r>
       </w:hyperlink>
     </w:p>
-    <w:bookmarkEnd w:id="87"/>
-    <w:bookmarkStart w:id="89" w:name="ref-lenaker2021"/>
+    <w:bookmarkEnd w:id="91"/>
+    <w:bookmarkStart w:id="93" w:name="ref-lenaker2021"/>
     <w:p>
       <w:pPr>
         <w:pStyle w:val="Bibliography"/>
@@ -4470,7 +4084,7 @@
       <w:r>
         <w:t xml:space="preserve"> </w:t>
       </w:r>
-      <w:hyperlink r:id="rId88">
+      <w:hyperlink r:id="rId92">
         <w:r>
           <w:rPr>
             <w:rStyle w:val="InternetLink"/>
@@ -4479,8 +4093,8 @@
         </w:r>
       </w:hyperlink>
     </w:p>
-    <w:bookmarkEnd w:id="89"/>
-    <w:bookmarkStart w:id="91" w:name="ref-lenth2024"/>
+    <w:bookmarkEnd w:id="93"/>
+    <w:bookmarkStart w:id="95" w:name="ref-lenth2024"/>
     <w:p>
       <w:pPr>
         <w:pStyle w:val="Bibliography"/>
@@ -4491,7 +4105,7 @@
       <w:r>
         <w:t xml:space="preserve"> </w:t>
       </w:r>
-      <w:hyperlink r:id="rId90">
+      <w:hyperlink r:id="rId94">
         <w:r>
           <w:rPr>
             <w:rStyle w:val="InternetLink"/>
@@ -4500,8 +4114,8 @@
         </w:r>
       </w:hyperlink>
     </w:p>
-    <w:bookmarkEnd w:id="91"/>
-    <w:bookmarkStart w:id="93" w:name="ref-leonard2024"/>
+    <w:bookmarkEnd w:id="95"/>
+    <w:bookmarkStart w:id="97" w:name="ref-leonard2024"/>
     <w:p>
       <w:pPr>
         <w:pStyle w:val="Bibliography"/>
@@ -4512,7 +4126,7 @@
       <w:r>
         <w:t xml:space="preserve"> </w:t>
       </w:r>
-      <w:hyperlink r:id="rId92">
+      <w:hyperlink r:id="rId96">
         <w:r>
           <w:rPr>
             <w:rStyle w:val="InternetLink"/>
@@ -4521,8 +4135,8 @@
         </w:r>
       </w:hyperlink>
     </w:p>
-    <w:bookmarkEnd w:id="93"/>
-    <w:bookmarkStart w:id="95" w:name="ref-ludecke2021"/>
+    <w:bookmarkEnd w:id="97"/>
+    <w:bookmarkStart w:id="99" w:name="ref-ludecke2021"/>
     <w:p>
       <w:pPr>
         <w:pStyle w:val="Bibliography"/>
@@ -4554,7 +4168,7 @@
       <w:r>
         <w:t xml:space="preserve"> </w:t>
       </w:r>
-      <w:hyperlink r:id="rId94">
+      <w:hyperlink r:id="rId98">
         <w:r>
           <w:rPr>
             <w:rStyle w:val="InternetLink"/>
@@ -4563,8 +4177,8 @@
         </w:r>
       </w:hyperlink>
     </w:p>
-    <w:bookmarkEnd w:id="95"/>
-    <w:bookmarkStart w:id="97" w:name="ref-maqbool2024"/>
+    <w:bookmarkEnd w:id="99"/>
+    <w:bookmarkStart w:id="101" w:name="ref-maqbool2024"/>
     <w:p>
       <w:pPr>
         <w:pStyle w:val="Bibliography"/>
@@ -4575,7 +4189,7 @@
       <w:r>
         <w:t xml:space="preserve"> </w:t>
       </w:r>
-      <w:hyperlink r:id="rId96">
+      <w:hyperlink r:id="rId100">
         <w:r>
           <w:rPr>
             <w:rStyle w:val="InternetLink"/>
@@ -4584,8 +4198,8 @@
         </w:r>
       </w:hyperlink>
     </w:p>
-    <w:bookmarkEnd w:id="97"/>
-    <w:bookmarkStart w:id="99" w:name="ref-massicotte2023"/>
+    <w:bookmarkEnd w:id="101"/>
+    <w:bookmarkStart w:id="103" w:name="ref-massicotte2023"/>
     <w:p>
       <w:pPr>
         <w:pStyle w:val="Bibliography"/>
@@ -4596,7 +4210,7 @@
       <w:r>
         <w:t xml:space="preserve"> </w:t>
       </w:r>
-      <w:hyperlink r:id="rId98">
+      <w:hyperlink r:id="rId102">
         <w:r>
           <w:rPr>
             <w:rStyle w:val="InternetLink"/>
@@ -4605,8 +4219,8 @@
         </w:r>
       </w:hyperlink>
     </w:p>
-    <w:bookmarkEnd w:id="99"/>
-    <w:bookmarkStart w:id="100" w:name="ref-michalyna1988"/>
+    <w:bookmarkEnd w:id="103"/>
+    <w:bookmarkStart w:id="104" w:name="ref-michalyna1988"/>
     <w:p>
       <w:pPr>
         <w:pStyle w:val="Bibliography"/>
@@ -4663,8 +4277,8 @@
         <w:t xml:space="preserve">.</w:t>
       </w:r>
     </w:p>
-    <w:bookmarkEnd w:id="100"/>
-    <w:bookmarkStart w:id="102" w:name="ref-nutrien_esn_2026"/>
+    <w:bookmarkEnd w:id="104"/>
+    <w:bookmarkStart w:id="106" w:name="ref-nutrien_esn_2026"/>
     <w:p>
       <w:pPr>
         <w:pStyle w:val="Bibliography"/>
@@ -4684,7 +4298,7 @@
       <w:r>
         <w:t xml:space="preserve"> </w:t>
       </w:r>
-      <w:hyperlink r:id="rId101">
+      <w:hyperlink r:id="rId105">
         <w:r>
           <w:rPr>
             <w:rStyle w:val="InternetLink"/>
@@ -4693,8 +4307,8 @@
         </w:r>
       </w:hyperlink>
     </w:p>
-    <w:bookmarkEnd w:id="102"/>
-    <w:bookmarkStart w:id="104" w:name="ref-nutrien_esn_datasheet_2022"/>
+    <w:bookmarkEnd w:id="106"/>
+    <w:bookmarkStart w:id="108" w:name="ref-nutrien_esn_datasheet_2022"/>
     <w:p>
       <w:pPr>
         <w:pStyle w:val="Bibliography"/>
@@ -4717,7 +4331,7 @@
       <w:r>
         <w:t xml:space="preserve"> </w:t>
       </w:r>
-      <w:hyperlink r:id="rId103">
+      <w:hyperlink r:id="rId107">
         <w:r>
           <w:rPr>
             <w:rStyle w:val="InternetLink"/>
@@ -4726,8 +4340,8 @@
         </w:r>
       </w:hyperlink>
     </w:p>
-    <w:bookmarkEnd w:id="104"/>
-    <w:bookmarkStart w:id="106" w:name="ref-piehl2018"/>
+    <w:bookmarkEnd w:id="108"/>
+    <w:bookmarkStart w:id="110" w:name="ref-piehl2018"/>
     <w:p>
       <w:pPr>
         <w:pStyle w:val="Bibliography"/>
@@ -4738,7 +4352,7 @@
       <w:r>
         <w:t xml:space="preserve"> </w:t>
       </w:r>
-      <w:hyperlink r:id="rId105">
+      <w:hyperlink r:id="rId109">
         <w:r>
           <w:rPr>
             <w:rStyle w:val="InternetLink"/>
@@ -4747,8 +4361,8 @@
         </w:r>
       </w:hyperlink>
     </w:p>
-    <w:bookmarkEnd w:id="106"/>
-    <w:bookmarkStart w:id="108" w:name="ref-rcoreteam2026"/>
+    <w:bookmarkEnd w:id="110"/>
+    <w:bookmarkStart w:id="112" w:name="ref-rcoreteam2026"/>
     <w:p>
       <w:pPr>
         <w:pStyle w:val="Bibliography"/>
@@ -4759,7 +4373,7 @@
       <w:r>
         <w:t xml:space="preserve"> </w:t>
       </w:r>
-      <w:hyperlink r:id="rId107">
+      <w:hyperlink r:id="rId111">
         <w:r>
           <w:rPr>
             <w:rStyle w:val="InternetLink"/>
@@ -4768,8 +4382,8 @@
         </w:r>
       </w:hyperlink>
     </w:p>
-    <w:bookmarkEnd w:id="108"/>
-    <w:bookmarkStart w:id="110" w:name="ref-rehm2024"/>
+    <w:bookmarkEnd w:id="112"/>
+    <w:bookmarkStart w:id="114" w:name="ref-rehm2024"/>
     <w:p>
       <w:pPr>
         <w:pStyle w:val="Bibliography"/>
@@ -4780,7 +4394,7 @@
       <w:r>
         <w:t xml:space="preserve"> </w:t>
       </w:r>
-      <w:hyperlink r:id="rId109">
+      <w:hyperlink r:id="rId113">
         <w:r>
           <w:rPr>
             <w:rStyle w:val="InternetLink"/>
@@ -4789,8 +4403,8 @@
         </w:r>
       </w:hyperlink>
     </w:p>
-    <w:bookmarkEnd w:id="110"/>
-    <w:bookmarkStart w:id="112" w:name="ref-rehm2021"/>
+    <w:bookmarkEnd w:id="114"/>
+    <w:bookmarkStart w:id="116" w:name="ref-rehm2021"/>
     <w:p>
       <w:pPr>
         <w:pStyle w:val="Bibliography"/>
@@ -4801,7 +4415,7 @@
       <w:r>
         <w:t xml:space="preserve"> </w:t>
       </w:r>
-      <w:hyperlink r:id="rId111">
+      <w:hyperlink r:id="rId115">
         <w:r>
           <w:rPr>
             <w:rStyle w:val="InternetLink"/>
@@ -4810,8 +4424,8 @@
         </w:r>
       </w:hyperlink>
     </w:p>
-    <w:bookmarkEnd w:id="112"/>
-    <w:bookmarkStart w:id="114" w:name="ref-rillig2017"/>
+    <w:bookmarkEnd w:id="116"/>
+    <w:bookmarkStart w:id="118" w:name="ref-rillig2017"/>
     <w:p>
       <w:pPr>
         <w:pStyle w:val="Bibliography"/>
@@ -4822,7 +4436,7 @@
       <w:r>
         <w:t xml:space="preserve"> </w:t>
       </w:r>
-      <w:hyperlink r:id="rId113">
+      <w:hyperlink r:id="rId117">
         <w:r>
           <w:rPr>
             <w:rStyle w:val="InternetLink"/>
@@ -4831,8 +4445,8 @@
         </w:r>
       </w:hyperlink>
     </w:p>
-    <w:bookmarkEnd w:id="114"/>
-    <w:bookmarkStart w:id="116" w:name="ref-rstudio2026"/>
+    <w:bookmarkEnd w:id="118"/>
+    <w:bookmarkStart w:id="120" w:name="ref-rstudio2026"/>
     <w:p>
       <w:pPr>
         <w:pStyle w:val="Bibliography"/>
@@ -4843,7 +4457,7 @@
       <w:r>
         <w:t xml:space="preserve"> </w:t>
       </w:r>
-      <w:hyperlink r:id="rId115">
+      <w:hyperlink r:id="rId119">
         <w:r>
           <w:rPr>
             <w:rStyle w:val="InternetLink"/>
@@ -4852,8 +4466,8 @@
         </w:r>
       </w:hyperlink>
     </w:p>
-    <w:bookmarkEnd w:id="116"/>
-    <w:bookmarkStart w:id="118" w:name="ref-severe2025"/>
+    <w:bookmarkEnd w:id="120"/>
+    <w:bookmarkStart w:id="122" w:name="ref-severe2025"/>
     <w:p>
       <w:pPr>
         <w:pStyle w:val="Bibliography"/>
@@ -4864,7 +4478,7 @@
       <w:r>
         <w:t xml:space="preserve"> </w:t>
       </w:r>
-      <w:hyperlink r:id="rId117">
+      <w:hyperlink r:id="rId121">
         <w:r>
           <w:rPr>
             <w:rStyle w:val="InternetLink"/>
@@ -4873,8 +4487,8 @@
         </w:r>
       </w:hyperlink>
     </w:p>
-    <w:bookmarkEnd w:id="118"/>
-    <w:bookmarkStart w:id="119" w:name="ref-tiessen2010"/>
+    <w:bookmarkEnd w:id="122"/>
+    <w:bookmarkStart w:id="123" w:name="ref-tiessen2010"/>
     <w:p>
       <w:pPr>
         <w:pStyle w:val="Bibliography"/>
@@ -4883,8 +4497,8 @@
         <w:t xml:space="preserve">Tiessen, K.H.D., Elliott, J.A., Yarotski, J., Lobb, D.A., Flaten, D.N., Glozier, N.E., 2010. Conventional and conservation tillage: Influence on seasonal runoff, sediment, and nutrient losses in the canadian prairies. Journal of Environmental Quality 39, 964980.</w:t>
       </w:r>
     </w:p>
-    <w:bookmarkEnd w:id="119"/>
-    <w:bookmarkStart w:id="121" w:name="ref-wang2024"/>
+    <w:bookmarkEnd w:id="123"/>
+    <w:bookmarkStart w:id="125" w:name="ref-wang2024"/>
     <w:p>
       <w:pPr>
         <w:pStyle w:val="Bibliography"/>
@@ -4895,7 +4509,7 @@
       <w:r>
         <w:t xml:space="preserve"> </w:t>
       </w:r>
-      <w:hyperlink r:id="rId120">
+      <w:hyperlink r:id="rId124">
         <w:r>
           <w:rPr>
             <w:rStyle w:val="InternetLink"/>
@@ -4904,8 +4518,8 @@
         </w:r>
       </w:hyperlink>
     </w:p>
-    <w:bookmarkEnd w:id="121"/>
-    <w:bookmarkStart w:id="123" w:name="ref-weber2021"/>
+    <w:bookmarkEnd w:id="125"/>
+    <w:bookmarkStart w:id="127" w:name="ref-weber2021"/>
     <w:p>
       <w:pPr>
         <w:pStyle w:val="Bibliography"/>
@@ -4916,7 +4530,7 @@
       <w:r>
         <w:t xml:space="preserve"> </w:t>
       </w:r>
-      <w:hyperlink r:id="rId122">
+      <w:hyperlink r:id="rId126">
         <w:r>
           <w:rPr>
             <w:rStyle w:val="InternetLink"/>
@@ -4925,8 +4539,8 @@
         </w:r>
       </w:hyperlink>
     </w:p>
-    <w:bookmarkEnd w:id="123"/>
-    <w:bookmarkStart w:id="124" w:name="ref-wickham2016"/>
+    <w:bookmarkEnd w:id="127"/>
+    <w:bookmarkStart w:id="128" w:name="ref-wickham2016"/>
     <w:p>
       <w:pPr>
         <w:pStyle w:val="Bibliography"/>
@@ -4935,8 +4549,8 @@
         <w:t xml:space="preserve">Wickham, H., 2016. ggplot2: Elegant graphics for data analysis. Springer-Verlag, New York NY U.S.A.</w:t>
       </w:r>
     </w:p>
-    <w:bookmarkEnd w:id="124"/>
-    <w:bookmarkStart w:id="126" w:name="ref-zhang2022"/>
+    <w:bookmarkEnd w:id="128"/>
+    <w:bookmarkStart w:id="130" w:name="ref-zhang2022"/>
     <w:p>
       <w:pPr>
         <w:pStyle w:val="Bibliography"/>
@@ -4947,7 +4561,7 @@
       <w:r>
         <w:t xml:space="preserve"> </w:t>
       </w:r>
-      <w:hyperlink r:id="rId125">
+      <w:hyperlink r:id="rId129">
         <w:r>
           <w:rPr>
             <w:rStyle w:val="InternetLink"/>
@@ -4956,10 +4570,10 @@
         </w:r>
       </w:hyperlink>
     </w:p>
-    <w:bookmarkEnd w:id="126"/>
-    <w:bookmarkEnd w:id="127"/>
-    <w:bookmarkEnd w:id="128"/>
-    <w:bookmarkStart w:id="129" w:name="figure-captions"/>
+    <w:bookmarkEnd w:id="130"/>
+    <w:bookmarkEnd w:id="131"/>
+    <w:bookmarkEnd w:id="132"/>
+    <w:bookmarkStart w:id="133" w:name="figure-captions"/>
     <w:p>
       <w:pPr>
         <w:pStyle w:val="Heading2"/>
@@ -5000,8 +4614,8 @@
         <w:t xml:space="preserve">Figure 4: Polymer density (a) and abundance (b) for two sampling depths (0-5 and 5-10 cm) and the combined (0-10 cm) by slope position. Samples were collected on 2023-09-19 and no polymer was detected below 5 cm in the riparian area.</w:t>
       </w:r>
     </w:p>
-    <w:bookmarkEnd w:id="129"/>
-    <w:bookmarkStart w:id="134" w:name="supplemental-materials"/>
+    <w:bookmarkEnd w:id="133"/>
+    <w:bookmarkStart w:id="142" w:name="supplemental-materials"/>
     <w:p>
       <w:pPr>
         <w:pStyle w:val="Heading2"/>
@@ -5023,7 +4637,7 @@
       <w:tr>
         <w:tc>
           <w:tcPr/>
-          <w:bookmarkStart w:id="133" w:name="suppfig-climate-normals"/>
+          <w:bookmarkStart w:id="137" w:name="suppfig-climate-normals"/>
           <w:p>
             <w:pPr>
               <w:pStyle w:val="Compact"/>
@@ -5034,18 +4648,18 @@
                 <wp:inline>
                   <wp:extent cx="5943600" cy="4456441"/>
                   <wp:effectExtent b="0" l="0" r="0" t="0"/>
-                  <wp:docPr descr="" title="" id="131" name="Picture"/>
+                  <wp:docPr descr="" title="" id="135" name="Picture"/>
                   <a:graphic>
                     <a:graphicData uri="http://schemas.openxmlformats.org/drawingml/2006/picture">
                       <pic:pic>
                         <pic:nvPicPr>
-                          <pic:cNvPr descr="./Figures/Figure%20S1.png" id="132" name="Picture"/>
+                          <pic:cNvPr descr="./Figures/Figure%20S1.png" id="136" name="Picture"/>
                           <pic:cNvPicPr>
                             <a:picLocks noChangeArrowheads="1" noChangeAspect="1"/>
                           </pic:cNvPicPr>
                         </pic:nvPicPr>
                         <pic:blipFill>
-                          <a:blip r:embed="rId130"/>
+                          <a:blip r:embed="rId134"/>
                           <a:stretch>
                             <a:fillRect/>
                           </a:stretch>
@@ -5077,7 +4691,7 @@
               <w:jc w:val="center"/>
             </w:pPr>
             <w:pPr>
-              <w:jc w:val="left"/>
+              <w:jc w:val="start"/>
               <w:spacing w:before="200"/>
               <w:pStyle w:val="ImageCaption"/>
             </w:pPr>
@@ -5085,11 +4699,98 @@
               <w:t xml:space="preserve">Figure S1: Climate Normals (1991-2020) for Morden, MB (Climate ID 5021849), located approximately 30 km from the field site.</w:t>
             </w:r>
           </w:p>
-          <w:bookmarkEnd w:id="133"/>
+          <w:bookmarkEnd w:id="137"/>
         </w:tc>
       </w:tr>
     </w:tbl>
-    <w:bookmarkEnd w:id="134"/>
+    <w:p>
+      <w:pPr>
+        <w:pStyle w:val="TextBody"/>
+      </w:pPr>
+      <w:r>
+        <w:t xml:space="preserve"> </w:t>
+      </w:r>
+    </w:p>
+    <w:tbl>
+      <w:tblPr>
+        <w:tblStyle w:val="Table"/>
+        <w:tblW w:type="pct" w:w="5000"/>
+        <w:tblLayout w:type="fixed"/>
+        <w:tblLook w:firstRow="0" w:lastRow="0" w:firstColumn="0" w:lastColumn="0" w:noHBand="0" w:noVBand="0" w:val="0000"/>
+      </w:tblPr>
+      <w:tblGrid>
+        <w:gridCol w:w="7920"/>
+      </w:tblGrid>
+      <w:tr>
+        <w:tc>
+          <w:tcPr/>
+          <w:bookmarkStart w:id="141" w:name="suppfig-weather-climate"/>
+          <w:p>
+            <w:pPr>
+              <w:pStyle w:val="Compact"/>
+              <w:jc w:val="center"/>
+            </w:pPr>
+            <w:r>
+              <w:drawing>
+                <wp:inline>
+                  <wp:extent cx="5943600" cy="4194045"/>
+                  <wp:effectExtent b="0" l="0" r="0" t="0"/>
+                  <wp:docPr descr="" title="" id="139" name="Picture"/>
+                  <a:graphic>
+                    <a:graphicData uri="http://schemas.openxmlformats.org/drawingml/2006/picture">
+                      <pic:pic>
+                        <pic:nvPicPr>
+                          <pic:cNvPr descr="./Figures/Figure%20S2.png" id="140" name="Picture"/>
+                          <pic:cNvPicPr>
+                            <a:picLocks noChangeArrowheads="1" noChangeAspect="1"/>
+                          </pic:cNvPicPr>
+                        </pic:nvPicPr>
+                        <pic:blipFill>
+                          <a:blip r:embed="rId138"/>
+                          <a:stretch>
+                            <a:fillRect/>
+                          </a:stretch>
+                        </pic:blipFill>
+                        <pic:spPr bwMode="auto">
+                          <a:xfrm>
+                            <a:off x="0" y="0"/>
+                            <a:ext cx="5943600" cy="4194045"/>
+                          </a:xfrm>
+                          <a:prstGeom prst="rect">
+                            <a:avLst/>
+                          </a:prstGeom>
+                          <a:noFill/>
+                          <a:ln w="9525">
+                            <a:noFill/>
+                            <a:headEnd/>
+                            <a:tailEnd/>
+                          </a:ln>
+                        </pic:spPr>
+                      </pic:pic>
+                    </a:graphicData>
+                  </a:graphic>
+                </wp:inline>
+              </w:drawing>
+            </w:r>
+          </w:p>
+          <w:p>
+            <w:pPr>
+              <w:jc w:val="center"/>
+            </w:pPr>
+            <w:pPr>
+              <w:jc w:val="start"/>
+              <w:spacing w:before="200"/>
+              <w:pStyle w:val="ImageCaption"/>
+            </w:pPr>
+            <w:r>
+              <w:t xml:space="preserve">Figure S2: Weather conditions for the 2022 and 2023 water years (Oct 1 - Sept 30) for Deerwood, MB (Station ID 29886), located approximately 8 km from the field site. Vertical lines indicate the timing of (1) application of Environmental Smart Nitrogen (ESN) (polymer-coated slow-release urea); (2) seeding and tillage field operations; and (3) collection of soil and runoff samples. Red and blue points indicate average daily temperatures above and below 0 degrees Celsius, respectively. The blue line indicates cumulative precipitation over the hydrologic year.</w:t>
+            </w:r>
+          </w:p>
+          <w:bookmarkEnd w:id="141"/>
+        </w:tc>
+      </w:tr>
+    </w:tbl>
+    <w:bookmarkEnd w:id="142"/>
     <w:sectPr>
       <w:footnotePr>
         <w:numFmt w:val="decimal"/>

</xml_diff>